<commit_message>
Working on jail template.
</commit_message>
<xml_diff>
--- a/resources/Templates/Jail_Plea_Final_Judgment_Template.docx
+++ b/resources/Templates/Jail_Plea_Final_Judgment_Template.docx
@@ -1,6 +1,6 @@
 
 <file path=word/document.xml><?xml version="1.0" encoding="utf-8"?>
-<w:document xmlns:wpc="http://schemas.microsoft.com/office/word/2010/wordprocessingCanvas" xmlns:cx="http://schemas.microsoft.com/office/drawing/2014/chartex" xmlns:cx1="http://schemas.microsoft.com/office/drawing/2015/9/8/chartex" xmlns:cx2="http://schemas.microsoft.com/office/drawing/2015/10/21/chartex" xmlns:cx3="http://schemas.microsoft.com/office/drawing/2016/5/9/chartex" xmlns:cx4="http://schemas.microsoft.com/office/drawing/2016/5/10/chartex" xmlns:cx5="http://schemas.microsoft.com/office/drawing/2016/5/11/chartex" xmlns:cx6="http://schemas.microsoft.com/office/drawing/2016/5/12/chartex" xmlns:cx7="http://schemas.microsoft.com/office/drawing/2016/5/13/chartex" xmlns:cx8="http://schemas.microsoft.com/office/drawing/2016/5/14/chartex" xmlns:mc="http://schemas.openxmlformats.org/markup-compatibility/2006" xmlns:aink="http://schemas.microsoft.com/office/drawing/2016/ink" xmlns:am3d="http://schemas.microsoft.com/office/drawing/2017/model3d" xmlns:o="urn:schemas-microsoft-com:office:office" xmlns:oel="http://schemas.microsoft.com/office/2019/extlst" xmlns:r="http://schemas.openxmlformats.org/officeDocument/2006/relationships" xmlns:m="http://schemas.openxmlformats.org/officeDocument/2006/math" xmlns:v="urn:schemas-microsoft-com:vml" xmlns:wp14="http://schemas.microsoft.com/office/word/2010/wordprocessingDrawing" xmlns:wp="http://schemas.openxmlformats.org/drawingml/2006/wordprocessingDrawing" xmlns:w10="urn:schemas-microsoft-com:office:word" xmlns:w="http://schemas.openxmlformats.org/wordprocessingml/2006/main" xmlns:w14="http://schemas.microsoft.com/office/word/2010/wordml" xmlns:w15="http://schemas.microsoft.com/office/word/2012/wordml" xmlns:w16cex="http://schemas.microsoft.com/office/word/2018/wordml/cex" xmlns:w16cid="http://schemas.microsoft.com/office/word/2016/wordml/cid" xmlns:w16="http://schemas.microsoft.com/office/word/2018/wordml" xmlns:w16du="http://schemas.microsoft.com/office/word/2023/wordml/word16du" xmlns:w16sdtdh="http://schemas.microsoft.com/office/word/2020/wordml/sdtdatahash" xmlns:w16se="http://schemas.microsoft.com/office/word/2015/wordml/symex" xmlns:wpg="http://schemas.microsoft.com/office/word/2010/wordprocessingGroup" xmlns:wpi="http://schemas.microsoft.com/office/word/2010/wordprocessingInk" xmlns:wne="http://schemas.microsoft.com/office/word/2006/wordml" xmlns:wps="http://schemas.microsoft.com/office/word/2010/wordprocessingShape" mc:Ignorable="w14 w15 w16se w16cid w16 w16cex w16sdtdh wp14">
+<w:document xmlns:wpc="http://schemas.microsoft.com/office/word/2010/wordprocessingCanvas" xmlns:cx="http://schemas.microsoft.com/office/drawing/2014/chartex" xmlns:cx1="http://schemas.microsoft.com/office/drawing/2015/9/8/chartex" xmlns:cx2="http://schemas.microsoft.com/office/drawing/2015/10/21/chartex" xmlns:cx3="http://schemas.microsoft.com/office/drawing/2016/5/9/chartex" xmlns:cx4="http://schemas.microsoft.com/office/drawing/2016/5/10/chartex" xmlns:cx5="http://schemas.microsoft.com/office/drawing/2016/5/11/chartex" xmlns:cx6="http://schemas.microsoft.com/office/drawing/2016/5/12/chartex" xmlns:cx7="http://schemas.microsoft.com/office/drawing/2016/5/13/chartex" xmlns:cx8="http://schemas.microsoft.com/office/drawing/2016/5/14/chartex" xmlns:mc="http://schemas.openxmlformats.org/markup-compatibility/2006" xmlns:aink="http://schemas.microsoft.com/office/drawing/2016/ink" xmlns:am3d="http://schemas.microsoft.com/office/drawing/2017/model3d" xmlns:o="urn:schemas-microsoft-com:office:office" xmlns:oel="http://schemas.microsoft.com/office/2019/extlst" xmlns:r="http://schemas.openxmlformats.org/officeDocument/2006/relationships" xmlns:m="http://schemas.openxmlformats.org/officeDocument/2006/math" xmlns:v="urn:schemas-microsoft-com:vml" xmlns:wp14="http://schemas.microsoft.com/office/word/2010/wordprocessingDrawing" xmlns:wp="http://schemas.openxmlformats.org/drawingml/2006/wordprocessingDrawing" xmlns:w10="urn:schemas-microsoft-com:office:word" xmlns:w="http://schemas.openxmlformats.org/wordprocessingml/2006/main" xmlns:w14="http://schemas.microsoft.com/office/word/2010/wordml" xmlns:w15="http://schemas.microsoft.com/office/word/2012/wordml" xmlns:w16cex="http://schemas.microsoft.com/office/word/2018/wordml/cex" xmlns:w16cid="http://schemas.microsoft.com/office/word/2016/wordml/cid" xmlns:w16="http://schemas.microsoft.com/office/word/2018/wordml" xmlns:w16sdtdh="http://schemas.microsoft.com/office/word/2020/wordml/sdtdatahash" xmlns:w16se="http://schemas.microsoft.com/office/word/2015/wordml/symex" xmlns:wpg="http://schemas.microsoft.com/office/word/2010/wordprocessingGroup" xmlns:wpi="http://schemas.microsoft.com/office/word/2010/wordprocessingInk" xmlns:wne="http://schemas.microsoft.com/office/word/2006/wordml" xmlns:wps="http://schemas.microsoft.com/office/word/2010/wordprocessingShape" mc:Ignorable="w14 w15 w16se w16cid w16 w16cex w16sdtdh wp14">
   <w:body>
     <w:p>
       <w:pPr>
@@ -840,55 +840,128 @@
           <w:sz w:val="20"/>
           <w:szCs w:val="20"/>
         </w:rPr>
-        <w:t>The Court explained that Defendant was charged with the offense</w:t>
-      </w:r>
-      <w:r>
-        <w:rPr>
-          <w:rFonts w:ascii="Palatino Linotype" w:hAnsi="Palatino Linotype"/>
-          <w:sz w:val="20"/>
-          <w:szCs w:val="20"/>
-        </w:rPr>
-        <w:t>(</w:t>
-      </w:r>
-      <w:r>
-        <w:rPr>
-          <w:rFonts w:ascii="Palatino Linotype" w:hAnsi="Palatino Linotype"/>
-          <w:sz w:val="20"/>
-          <w:szCs w:val="20"/>
-        </w:rPr>
-        <w:t>s</w:t>
-      </w:r>
-      <w:r>
-        <w:rPr>
-          <w:rFonts w:ascii="Palatino Linotype" w:hAnsi="Palatino Linotype"/>
-          <w:sz w:val="20"/>
-          <w:szCs w:val="20"/>
-        </w:rPr>
-        <w:t>)</w:t>
-      </w:r>
-      <w:r>
-        <w:rPr>
-          <w:rFonts w:ascii="Palatino Linotype" w:hAnsi="Palatino Linotype"/>
-          <w:sz w:val="20"/>
-          <w:szCs w:val="20"/>
-        </w:rPr>
-        <w:t xml:space="preserve"> set fo</w:t>
-      </w:r>
-      <w:r>
-        <w:rPr>
-          <w:rFonts w:ascii="Palatino Linotype" w:hAnsi="Palatino Linotype"/>
-          <w:sz w:val="20"/>
-          <w:szCs w:val="20"/>
-        </w:rPr>
-        <w:t xml:space="preserve">rth below. </w:t>
-      </w:r>
-      <w:r>
-        <w:rPr>
-          <w:rFonts w:ascii="Palatino Linotype" w:hAnsi="Palatino Linotype"/>
-          <w:sz w:val="20"/>
-          <w:szCs w:val="20"/>
-        </w:rPr>
-        <w:t>The Court advised that if Defendant is not a United States citizen any plea or conviction could result in deportation, exclusion from admission into the United States, or denial of naturalization under United States law.</w:t>
+        <w:t xml:space="preserve">The Defendant </w:t>
+      </w:r>
+      <w:r>
+        <w:rPr>
+          <w:rFonts w:ascii="Palatino Linotype" w:hAnsi="Palatino Linotype"/>
+          <w:sz w:val="20"/>
+          <w:szCs w:val="20"/>
+        </w:rPr>
+        <w:t xml:space="preserve">understood the nature of the charge(s), all constitutional rights, potential consequences to citizenship, and the effects of the plea. </w:t>
+      </w:r>
+      <w:r>
+        <w:rPr>
+          <w:rFonts w:ascii="Palatino Linotype" w:hAnsi="Palatino Linotype"/>
+          <w:vanish/>
+          <w:sz w:val="20"/>
+          <w:szCs w:val="20"/>
+        </w:rPr>
+        <w:t xml:space="preserve">R.C. 2943.031. </w:t>
+      </w:r>
+      <w:r>
+        <w:rPr>
+          <w:rFonts w:ascii="Palatino Linotype" w:hAnsi="Palatino Linotype"/>
+          <w:sz w:val="20"/>
+          <w:szCs w:val="20"/>
+        </w:rPr>
+        <w:t>{% endif %}</w:t>
+      </w:r>
+      <w:r>
+        <w:rPr>
+          <w:rFonts w:ascii="Palatino Linotype" w:hAnsi="Palatino Linotype"/>
+          <w:sz w:val="20"/>
+          <w:szCs w:val="20"/>
+        </w:rPr>
+        <w:t xml:space="preserve">{% if offense_of_violence is true %}The Court </w:t>
+      </w:r>
+      <w:r>
+        <w:rPr>
+          <w:rFonts w:ascii="Palatino Linotype" w:hAnsi="Palatino Linotype"/>
+          <w:sz w:val="20"/>
+          <w:szCs w:val="20"/>
+        </w:rPr>
+        <w:t>advised</w:t>
+      </w:r>
+      <w:r>
+        <w:rPr>
+          <w:rFonts w:ascii="Palatino Linotype" w:hAnsi="Palatino Linotype"/>
+          <w:sz w:val="20"/>
+          <w:szCs w:val="20"/>
+        </w:rPr>
+        <w:t xml:space="preserve"> Defendant: </w:t>
+      </w:r>
+      <w:r>
+        <w:rPr>
+          <w:rFonts w:ascii="Palatino Linotype" w:hAnsi="Palatino Linotype"/>
+          <w:sz w:val="20"/>
+          <w:szCs w:val="20"/>
+        </w:rPr>
+        <w:t>18 U.S.C § 922(g)(9) prohibits shipping, transporting, purchasing, possessing, or owning a firearm or ammunition</w:t>
+      </w:r>
+      <w:r>
+        <w:rPr>
+          <w:rFonts w:ascii="Palatino Linotype" w:hAnsi="Palatino Linotype"/>
+          <w:sz w:val="20"/>
+          <w:szCs w:val="20"/>
+        </w:rPr>
+        <w:t>; a</w:t>
+      </w:r>
+      <w:r>
+        <w:rPr>
+          <w:rFonts w:ascii="Palatino Linotype" w:hAnsi="Palatino Linotype"/>
+          <w:sz w:val="20"/>
+          <w:szCs w:val="20"/>
+        </w:rPr>
+        <w:t xml:space="preserve"> conviction may escalate subsequent violations into felonies</w:t>
+      </w:r>
+      <w:r>
+        <w:rPr>
+          <w:rFonts w:ascii="Palatino Linotype" w:hAnsi="Palatino Linotype"/>
+          <w:sz w:val="20"/>
+          <w:szCs w:val="20"/>
+        </w:rPr>
+        <w:t xml:space="preserve">; and a </w:t>
+      </w:r>
+      <w:r>
+        <w:rPr>
+          <w:rFonts w:ascii="Palatino Linotype" w:hAnsi="Palatino Linotype"/>
+          <w:sz w:val="20"/>
+          <w:szCs w:val="20"/>
+        </w:rPr>
+        <w:t xml:space="preserve">conviction may </w:t>
+      </w:r>
+      <w:r>
+        <w:rPr>
+          <w:rFonts w:ascii="Palatino Linotype" w:hAnsi="Palatino Linotype"/>
+          <w:sz w:val="20"/>
+          <w:szCs w:val="20"/>
+        </w:rPr>
+        <w:t>make</w:t>
+      </w:r>
+      <w:r>
+        <w:rPr>
+          <w:rFonts w:ascii="Palatino Linotype" w:hAnsi="Palatino Linotype"/>
+          <w:sz w:val="20"/>
+          <w:szCs w:val="20"/>
+        </w:rPr>
+        <w:t xml:space="preserve"> Defendant ineligible for certain state and federal benefits. {% endif %}</w:t>
+      </w:r>
+      <w:r>
+        <w:rPr>
+          <w:rFonts w:ascii="Palatino Linotype" w:hAnsi="Palatino Linotype"/>
+          <w:sz w:val="20"/>
+          <w:szCs w:val="20"/>
+        </w:rPr>
+        <w:t>{% if appearance_reason != ‘sentencing’ %}</w:t>
+      </w:r>
+      <w:r>
+        <w:rPr>
+          <w:rFonts w:ascii="Palatino Linotype" w:hAnsi="Palatino Linotype"/>
+          <w:sz w:val="20"/>
+          <w:szCs w:val="20"/>
+        </w:rPr>
+        <w:t>The Court</w:t>
       </w:r>
       <w:r>
         <w:rPr>
@@ -901,11 +974,50 @@
       <w:r>
         <w:rPr>
           <w:rFonts w:ascii="Palatino Linotype" w:hAnsi="Palatino Linotype"/>
-          <w:vanish/>
-          <w:sz w:val="20"/>
-          <w:szCs w:val="20"/>
-        </w:rPr>
-        <w:t xml:space="preserve">R.C. 2943.031. </w:t>
+          <w:sz w:val="20"/>
+          <w:szCs w:val="20"/>
+        </w:rPr>
+        <w:t>accepted Defendant’s</w:t>
+      </w:r>
+      <w:r>
+        <w:rPr>
+          <w:rFonts w:ascii="Palatino Linotype" w:hAnsi="Palatino Linotype"/>
+          <w:sz w:val="20"/>
+          <w:szCs w:val="20"/>
+        </w:rPr>
+        <w:t xml:space="preserve"> plea</w:t>
+      </w:r>
+      <w:r>
+        <w:rPr>
+          <w:rFonts w:ascii="Palatino Linotype" w:hAnsi="Palatino Linotype"/>
+          <w:sz w:val="20"/>
+          <w:szCs w:val="20"/>
+        </w:rPr>
+        <w:t>,</w:t>
+      </w:r>
+      <w:r>
+        <w:rPr>
+          <w:rFonts w:ascii="Palatino Linotype" w:hAnsi="Palatino Linotype"/>
+          <w:sz w:val="20"/>
+          <w:szCs w:val="20"/>
+        </w:rPr>
+        <w:t xml:space="preserve"> finding it was entered</w:t>
+      </w:r>
+      <w:r>
+        <w:rPr>
+          <w:rFonts w:ascii="Palatino Linotype" w:hAnsi="Palatino Linotype"/>
+          <w:sz w:val="20"/>
+          <w:szCs w:val="20"/>
+        </w:rPr>
+        <w:t xml:space="preserve"> knowingly, intelligently, and voluntarily</w:t>
+      </w:r>
+      <w:r>
+        <w:rPr>
+          <w:rFonts w:ascii="Palatino Linotype" w:hAnsi="Palatino Linotype"/>
+          <w:sz w:val="20"/>
+          <w:szCs w:val="20"/>
+        </w:rPr>
+        <w:t xml:space="preserve">. </w:t>
       </w:r>
       <w:r>
         <w:rPr>
@@ -921,176 +1033,7 @@
           <w:sz w:val="20"/>
           <w:szCs w:val="20"/>
         </w:rPr>
-        <w:t xml:space="preserve">{% if offense_of_violence is true %}The Court additionally informed the Defendant that a conviction in this case results in the following: </w:t>
-      </w:r>
-    </w:p>
-    <w:p>
-      <w:pPr>
-        <w:pStyle w:val="ListParagraph"/>
-        <w:numPr>
-          <w:ilvl w:val="0"/>
-          <w:numId w:val="4"/>
-        </w:numPr>
-        <w:jc w:val="both"/>
-        <w:rPr>
-          <w:rFonts w:ascii="Palatino Linotype" w:hAnsi="Palatino Linotype"/>
-          <w:sz w:val="20"/>
-          <w:szCs w:val="20"/>
-        </w:rPr>
-      </w:pPr>
-      <w:r>
-        <w:rPr>
-          <w:rFonts w:ascii="Palatino Linotype" w:hAnsi="Palatino Linotype"/>
-          <w:sz w:val="20"/>
-          <w:szCs w:val="20"/>
-        </w:rPr>
-        <w:t>18 U.S.C § 922(g)(9) prohibits the Defendant from shipping, transporting, purchasing, possessing, or owning a firearm or ammunition.</w:t>
-      </w:r>
-    </w:p>
-    <w:p>
-      <w:pPr>
-        <w:pStyle w:val="ListParagraph"/>
-        <w:numPr>
-          <w:ilvl w:val="0"/>
-          <w:numId w:val="4"/>
-        </w:numPr>
-        <w:jc w:val="both"/>
-        <w:rPr>
-          <w:rFonts w:ascii="Palatino Linotype" w:hAnsi="Palatino Linotype"/>
-          <w:sz w:val="20"/>
-          <w:szCs w:val="20"/>
-        </w:rPr>
-      </w:pPr>
-      <w:r>
-        <w:rPr>
-          <w:rFonts w:ascii="Palatino Linotype" w:hAnsi="Palatino Linotype"/>
-          <w:sz w:val="20"/>
-          <w:szCs w:val="20"/>
-        </w:rPr>
-        <w:t>A conviction in this case may escalate subsequent violations into felonies.</w:t>
-      </w:r>
-    </w:p>
-    <w:p>
-      <w:pPr>
-        <w:pStyle w:val="ListParagraph"/>
-        <w:numPr>
-          <w:ilvl w:val="0"/>
-          <w:numId w:val="4"/>
-        </w:numPr>
-        <w:jc w:val="both"/>
-        <w:rPr>
-          <w:rFonts w:ascii="Palatino Linotype" w:hAnsi="Palatino Linotype"/>
-          <w:sz w:val="20"/>
-          <w:szCs w:val="20"/>
-        </w:rPr>
-      </w:pPr>
-      <w:r>
-        <w:rPr>
-          <w:rFonts w:ascii="Palatino Linotype" w:hAnsi="Palatino Linotype"/>
-          <w:sz w:val="20"/>
-          <w:szCs w:val="20"/>
-        </w:rPr>
-        <w:t>A conviction in this case may render the Defendant ineligible for certain state and federal benefits. {% endif %}</w:t>
-      </w:r>
-    </w:p>
-    <w:p>
-      <w:pPr>
-        <w:jc w:val="both"/>
-        <w:rPr>
-          <w:rFonts w:ascii="Palatino Linotype" w:hAnsi="Palatino Linotype"/>
-          <w:sz w:val="20"/>
-          <w:szCs w:val="20"/>
-        </w:rPr>
-      </w:pPr>
-    </w:p>
-    <w:p>
-      <w:pPr>
-        <w:jc w:val="both"/>
-        <w:rPr>
-          <w:rFonts w:ascii="Palatino Linotype" w:hAnsi="Palatino Linotype"/>
-          <w:sz w:val="20"/>
-          <w:szCs w:val="20"/>
-        </w:rPr>
-      </w:pPr>
-      <w:r>
-        <w:rPr>
-          <w:rFonts w:ascii="Palatino Linotype" w:hAnsi="Palatino Linotype"/>
-          <w:sz w:val="20"/>
-          <w:szCs w:val="20"/>
-        </w:rPr>
-        <w:t>{% if appearance_reason != ‘sentencing’ %}</w:t>
-      </w:r>
-      <w:r>
-        <w:rPr>
-          <w:rFonts w:ascii="Palatino Linotype" w:hAnsi="Palatino Linotype"/>
-          <w:sz w:val="20"/>
-          <w:szCs w:val="20"/>
-        </w:rPr>
-        <w:t>The Defendant understood the nature of the charge(s), all constitutional rights, and the effects of a plea. Defendant entered a plea(s) to the charge(s) as set forth in the chart below. The Court</w:t>
-      </w:r>
-      <w:r>
-        <w:rPr>
-          <w:rFonts w:ascii="Palatino Linotype" w:hAnsi="Palatino Linotype"/>
-          <w:sz w:val="20"/>
-          <w:szCs w:val="20"/>
-        </w:rPr>
-        <w:t xml:space="preserve"> found</w:t>
-      </w:r>
-      <w:r>
-        <w:rPr>
-          <w:rFonts w:ascii="Palatino Linotype" w:hAnsi="Palatino Linotype"/>
-          <w:sz w:val="20"/>
-          <w:szCs w:val="20"/>
-        </w:rPr>
-        <w:t xml:space="preserve"> that the Defendant entered the plea knowingly, intelligently, and voluntarily, </w:t>
-      </w:r>
-      <w:r>
-        <w:rPr>
-          <w:rFonts w:ascii="Palatino Linotype" w:hAnsi="Palatino Linotype"/>
-          <w:sz w:val="20"/>
-          <w:szCs w:val="20"/>
-        </w:rPr>
-        <w:t xml:space="preserve">and </w:t>
-      </w:r>
-      <w:r>
-        <w:rPr>
-          <w:rFonts w:ascii="Palatino Linotype" w:hAnsi="Palatino Linotype"/>
-          <w:sz w:val="20"/>
-          <w:szCs w:val="20"/>
-        </w:rPr>
-        <w:t xml:space="preserve">the Court </w:t>
-      </w:r>
-      <w:r>
-        <w:rPr>
-          <w:rFonts w:ascii="Palatino Linotype" w:hAnsi="Palatino Linotype"/>
-          <w:sz w:val="20"/>
-          <w:szCs w:val="20"/>
-        </w:rPr>
-        <w:t>accepted the ple</w:t>
-      </w:r>
-      <w:r>
-        <w:rPr>
-          <w:rFonts w:ascii="Palatino Linotype" w:hAnsi="Palatino Linotype"/>
-          <w:sz w:val="20"/>
-          <w:szCs w:val="20"/>
-        </w:rPr>
-        <w:t xml:space="preserve">a. </w:t>
-      </w:r>
-      <w:r>
-        <w:rPr>
-          <w:rFonts w:ascii="Palatino Linotype" w:hAnsi="Palatino Linotype"/>
-          <w:sz w:val="20"/>
-          <w:szCs w:val="20"/>
-        </w:rPr>
-        <w:t>{% endif %}</w:t>
-      </w:r>
-      <w:r>
-        <w:rPr>
-          <w:rFonts w:ascii="Palatino Linotype" w:hAnsi="Palatino Linotype"/>
-          <w:sz w:val="20"/>
-          <w:szCs w:val="20"/>
-        </w:rPr>
-        <w:t>{% if victim_statements is true %}{{‘\n</w:t>
+        <w:t>{{‘\n</w:t>
       </w:r>
       <w:r>
         <w:rPr>
@@ -1106,7 +1049,55 @@
           <w:sz w:val="20"/>
           <w:szCs w:val="20"/>
         </w:rPr>
-        <w:t>’}}Prior to sentencing, the Court heard statements from the Prosecutor, Victim Advocate on behalf of the victim, Defense Counsel and the Defendant. The Court considered the overriding purposes of misdemeanor sentencing when making its findings. {% endif %}F</w:t>
+        <w:t xml:space="preserve">’}}Prior to sentencing, the Court heard statements from the Prosecutor, </w:t>
+      </w:r>
+      <w:r>
+        <w:rPr>
+          <w:rFonts w:ascii="Palatino Linotype" w:hAnsi="Palatino Linotype"/>
+          <w:sz w:val="20"/>
+          <w:szCs w:val="20"/>
+        </w:rPr>
+        <w:t>any Victim(s)/</w:t>
+      </w:r>
+      <w:r>
+        <w:rPr>
+          <w:rFonts w:ascii="Palatino Linotype" w:hAnsi="Palatino Linotype"/>
+          <w:sz w:val="20"/>
+          <w:szCs w:val="20"/>
+        </w:rPr>
+        <w:t>Victim</w:t>
+      </w:r>
+      <w:r>
+        <w:rPr>
+          <w:rFonts w:ascii="Palatino Linotype" w:hAnsi="Palatino Linotype"/>
+          <w:sz w:val="20"/>
+          <w:szCs w:val="20"/>
+        </w:rPr>
+        <w:t>’s</w:t>
+      </w:r>
+      <w:r>
+        <w:rPr>
+          <w:rFonts w:ascii="Palatino Linotype" w:hAnsi="Palatino Linotype"/>
+          <w:sz w:val="20"/>
+          <w:szCs w:val="20"/>
+        </w:rPr>
+        <w:t xml:space="preserve"> Advocate</w:t>
+      </w:r>
+      <w:r>
+        <w:rPr>
+          <w:rFonts w:ascii="Palatino Linotype" w:hAnsi="Palatino Linotype"/>
+          <w:sz w:val="20"/>
+          <w:szCs w:val="20"/>
+        </w:rPr>
+        <w:t>(s)</w:t>
+      </w:r>
+      <w:r>
+        <w:rPr>
+          <w:rFonts w:ascii="Palatino Linotype" w:hAnsi="Palatino Linotype"/>
+          <w:sz w:val="20"/>
+          <w:szCs w:val="20"/>
+        </w:rPr>
+        <w:t>, Defense Counsel and Defendant. The Court considered the overriding purposes of misdemeanor sentencing when making its findings. F</w:t>
       </w:r>
       <w:r>
         <w:rPr>
@@ -1405,18 +1396,7 @@
                 <w:sz w:val="20"/>
                 <w:szCs w:val="20"/>
               </w:rPr>
-              <w:t xml:space="preserve">{%tc for charge in </w:t>
-            </w:r>
-            <w:r>
-              <w:rPr>
-                <w:rFonts w:ascii="Palatino Linotype" w:hAnsi="Palatino Linotype"/>
-                <w:b/>
-                <w:bCs/>
-                <w:sz w:val="20"/>
-                <w:szCs w:val="20"/>
-              </w:rPr>
-              <w:lastRenderedPageBreak/>
-              <w:t>charges_list %}</w:t>
+              <w:t>{%tc for charge in charges_list %}</w:t>
             </w:r>
           </w:p>
         </w:tc>
@@ -1454,7 +1434,6 @@
                 <w:sz w:val="20"/>
                 <w:szCs w:val="20"/>
               </w:rPr>
-              <w:lastRenderedPageBreak/>
               <w:t>{{ charge.statute }}</w:t>
             </w:r>
           </w:p>
@@ -1731,7 +1710,18 @@
                 <w:sz w:val="20"/>
                 <w:szCs w:val="20"/>
               </w:rPr>
-              <w:t>{%tc for charge in charges_list %}</w:t>
+              <w:t xml:space="preserve">{%tc for charge in </w:t>
+            </w:r>
+            <w:r>
+              <w:rPr>
+                <w:rFonts w:ascii="Palatino Linotype" w:hAnsi="Palatino Linotype"/>
+                <w:b/>
+                <w:bCs/>
+                <w:sz w:val="20"/>
+                <w:szCs w:val="20"/>
+              </w:rPr>
+              <w:lastRenderedPageBreak/>
+              <w:t>charges_list %}</w:t>
             </w:r>
           </w:p>
         </w:tc>
@@ -1769,6 +1759,7 @@
                 <w:sz w:val="20"/>
                 <w:szCs w:val="20"/>
               </w:rPr>
+              <w:lastRenderedPageBreak/>
               <w:t>{{ charge.plea}}</w:t>
             </w:r>
           </w:p>
@@ -3390,222 +3381,224 @@
           <w:sz w:val="20"/>
           <w:szCs w:val="20"/>
         </w:rPr>
+        <w:t>Jail.</w:t>
+      </w:r>
+      <w:r>
+        <w:rPr>
+          <w:rFonts w:ascii="Palatino Linotype" w:hAnsi="Palatino Linotype"/>
+          <w:sz w:val="20"/>
+          <w:szCs w:val="20"/>
+        </w:rPr>
+        <w:t xml:space="preserve"> The 3-day jail sentence imposed in this case is suspended upon condition that Defendant complete the Driver Intervention Program within 90 days. See terms of Community Control. </w:t>
+      </w:r>
+      <w:r>
+        <w:rPr>
+          <w:rFonts w:ascii="Palatino Linotype" w:hAnsi="Palatino Linotype"/>
+          <w:sz w:val="20"/>
+          <w:szCs w:val="20"/>
+        </w:rPr>
+        <w:t>{{‘\n’}}</w:t>
+      </w:r>
+      <w:r>
+        <w:rPr>
+          <w:rFonts w:ascii="Palatino Linotype" w:hAnsi="Palatino Linotype"/>
+          <w:sz w:val="20"/>
+          <w:szCs w:val="20"/>
+        </w:rPr>
+        <w:t>{% endif %}{% if jail_terms.ordered is true %}{{‘\n’}}</w:t>
+      </w:r>
+      <w:r>
+        <w:rPr>
+          <w:rFonts w:ascii="Palatino Linotype" w:hAnsi="Palatino Linotype"/>
+          <w:b/>
+          <w:bCs/>
+          <w:sz w:val="20"/>
+          <w:szCs w:val="20"/>
+        </w:rPr>
+        <w:t>Jail</w:t>
+      </w:r>
+      <w:r>
+        <w:rPr>
+          <w:rFonts w:ascii="Palatino Linotype" w:hAnsi="Palatino Linotype"/>
+          <w:b/>
+          <w:bCs/>
+          <w:sz w:val="20"/>
+          <w:szCs w:val="20"/>
+        </w:rPr>
+        <w:t xml:space="preserve"> Term: </w:t>
+      </w:r>
+      <w:r>
+        <w:rPr>
+          <w:rFonts w:ascii="Palatino Linotype" w:hAnsi="Palatino Linotype"/>
+          <w:b/>
+          <w:bCs/>
+          <w:sz w:val="20"/>
+          <w:szCs w:val="20"/>
+        </w:rPr>
+        <w:t>{{ jail_terms.total_jail_days_to_serve }} days</w:t>
+      </w:r>
+      <w:r>
+        <w:rPr>
+          <w:rFonts w:ascii="Palatino Linotype" w:hAnsi="Palatino Linotype"/>
+          <w:sz w:val="20"/>
+          <w:szCs w:val="20"/>
+        </w:rPr>
+        <w:t>{% if jail_terms.apply_jtc == ‘Sentence’ %}</w:t>
+      </w:r>
+      <w:r>
+        <w:rPr>
+          <w:rFonts w:ascii="Palatino Linotype" w:hAnsi="Palatino Linotype"/>
+          <w:sz w:val="20"/>
+          <w:szCs w:val="20"/>
+        </w:rPr>
+        <w:t xml:space="preserve"> </w:t>
+      </w:r>
+      <w:r>
+        <w:rPr>
+          <w:rFonts w:ascii="Palatino Linotype" w:hAnsi="Palatino Linotype"/>
+          <w:b/>
+          <w:bCs/>
+          <w:sz w:val="20"/>
+          <w:szCs w:val="20"/>
+        </w:rPr>
+        <w:t>with</w:t>
+      </w:r>
+      <w:r>
+        <w:rPr>
+          <w:rFonts w:ascii="Palatino Linotype" w:hAnsi="Palatino Linotype"/>
+          <w:sz w:val="20"/>
+          <w:szCs w:val="20"/>
+        </w:rPr>
+        <w:t xml:space="preserve"> </w:t>
+      </w:r>
+      <w:r>
+        <w:rPr>
+          <w:rFonts w:ascii="Palatino Linotype" w:hAnsi="Palatino Linotype"/>
+          <w:b/>
+          <w:sz w:val="20"/>
+          <w:szCs w:val="20"/>
+        </w:rPr>
+        <w:t>credit for {{ jail_terms.days_in_jail }}</w:t>
+      </w:r>
+      <w:r>
+        <w:rPr>
+          <w:rFonts w:ascii="Palatino Linotype" w:hAnsi="Palatino Linotype"/>
+          <w:b/>
+          <w:sz w:val="20"/>
+          <w:szCs w:val="20"/>
+        </w:rPr>
+        <w:t xml:space="preserve"> days</w:t>
+      </w:r>
+      <w:r>
+        <w:rPr>
+          <w:rFonts w:ascii="Palatino Linotype" w:hAnsi="Palatino Linotype"/>
+          <w:sz w:val="20"/>
+          <w:szCs w:val="20"/>
+        </w:rPr>
+        <w:t xml:space="preserve"> </w:t>
+      </w:r>
+      <w:r>
+        <w:rPr>
+          <w:rFonts w:ascii="Palatino Linotype" w:hAnsi="Palatino Linotype"/>
+          <w:b/>
+          <w:bCs/>
+          <w:sz w:val="20"/>
+          <w:szCs w:val="20"/>
+        </w:rPr>
+        <w:t>served</w:t>
+      </w:r>
+      <w:r>
+        <w:rPr>
+          <w:rFonts w:ascii="Palatino Linotype" w:hAnsi="Palatino Linotype"/>
+          <w:sz w:val="20"/>
+          <w:szCs w:val="20"/>
+        </w:rPr>
+        <w:t>{% endif %}</w:t>
+      </w:r>
+      <w:r>
+        <w:rPr>
+          <w:rFonts w:ascii="Palatino Linotype" w:hAnsi="Palatino Linotype"/>
+          <w:b/>
+          <w:bCs/>
+          <w:sz w:val="20"/>
+          <w:szCs w:val="20"/>
+        </w:rPr>
+        <w:t>.</w:t>
+      </w:r>
+      <w:r>
+        <w:rPr>
+          <w:rFonts w:ascii="Palatino Linotype" w:hAnsi="Palatino Linotype"/>
+          <w:sz w:val="20"/>
+          <w:szCs w:val="20"/>
+        </w:rPr>
+        <w:t xml:space="preserve"> </w:t>
+      </w:r>
+      <w:r>
+        <w:rPr>
+          <w:rFonts w:ascii="Palatino Linotype" w:hAnsi="Palatino Linotype"/>
+          <w:sz w:val="20"/>
+          <w:szCs w:val="20"/>
+        </w:rPr>
+        <w:t>{% if jail_terms.report_type == ‘forthwith’ %}</w:t>
+      </w:r>
+      <w:r>
+        <w:rPr>
+          <w:rFonts w:ascii="Palatino Linotype" w:hAnsi="Palatino Linotype"/>
+          <w:sz w:val="20"/>
+          <w:szCs w:val="20"/>
+        </w:rPr>
+        <w:t>Defendant shall report to jail {{ jail_terms.report_type</w:t>
+      </w:r>
+      <w:r>
+        <w:rPr>
+          <w:rFonts w:ascii="Palatino Linotype" w:hAnsi="Palatino Linotype"/>
+          <w:sz w:val="20"/>
+          <w:szCs w:val="20"/>
+        </w:rPr>
+        <w:t xml:space="preserve"> }}.{% endif %}{% if jail_terms.report_type == ‘future date’ %}Defendant’s report date is </w:t>
+      </w:r>
+      <w:r>
+        <w:rPr>
+          <w:rFonts w:ascii="Palatino Linotype" w:hAnsi="Palatino Linotype"/>
+          <w:b/>
+          <w:sz w:val="20"/>
+          <w:szCs w:val="20"/>
+        </w:rPr>
+        <w:t>{{ jail_terms.report_date }}</w:t>
+      </w:r>
+      <w:r>
+        <w:rPr>
+          <w:rFonts w:ascii="Palatino Linotype" w:hAnsi="Palatino Linotype"/>
+          <w:b/>
+          <w:sz w:val="20"/>
+          <w:szCs w:val="20"/>
+        </w:rPr>
+        <w:t>, at {{ jail_terms.report_time }}</w:t>
+      </w:r>
+      <w:r>
+        <w:rPr>
+          <w:rFonts w:ascii="Palatino Linotype" w:hAnsi="Palatino Linotype"/>
+          <w:sz w:val="20"/>
+          <w:szCs w:val="20"/>
+        </w:rPr>
+        <w:t>.{% endif %}{% if jail_terms.report_type == ‘date set by Office of Community Control’ %}Defendant shall schedule the jail days imposed in this case through the Office of Community Control.{% endif %}</w:t>
+      </w:r>
+      <w:r>
+        <w:rPr>
+          <w:rFonts w:ascii="Palatino Linotype" w:hAnsi="Palatino Linotype"/>
+          <w:sz w:val="20"/>
+          <w:szCs w:val="20"/>
+        </w:rPr>
+        <w:t xml:space="preserve">{% if jail_terms.companion_cases_exist </w:t>
+      </w:r>
+      <w:r>
+        <w:rPr>
+          <w:rFonts w:ascii="Palatino Linotype" w:hAnsi="Palatino Linotype"/>
+          <w:sz w:val="20"/>
+          <w:szCs w:val="20"/>
+        </w:rPr>
         <w:lastRenderedPageBreak/>
-        <w:t>Jail.</w:t>
-      </w:r>
-      <w:r>
-        <w:rPr>
-          <w:rFonts w:ascii="Palatino Linotype" w:hAnsi="Palatino Linotype"/>
-          <w:sz w:val="20"/>
-          <w:szCs w:val="20"/>
-        </w:rPr>
-        <w:t xml:space="preserve"> The 3-day jail sentence imposed in this case is suspended upon condition that Defendant complete the Driver Intervention Program within 90 days. See terms of Community Control. </w:t>
-      </w:r>
-      <w:r>
-        <w:rPr>
-          <w:rFonts w:ascii="Palatino Linotype" w:hAnsi="Palatino Linotype"/>
-          <w:sz w:val="20"/>
-          <w:szCs w:val="20"/>
-        </w:rPr>
-        <w:t>{{‘\n’}}</w:t>
-      </w:r>
-      <w:r>
-        <w:rPr>
-          <w:rFonts w:ascii="Palatino Linotype" w:hAnsi="Palatino Linotype"/>
-          <w:sz w:val="20"/>
-          <w:szCs w:val="20"/>
-        </w:rPr>
-        <w:t>{% endif %}{% if jail_terms.ordered is true %}{{‘\n’}}</w:t>
-      </w:r>
-      <w:r>
-        <w:rPr>
-          <w:rFonts w:ascii="Palatino Linotype" w:hAnsi="Palatino Linotype"/>
-          <w:b/>
-          <w:bCs/>
-          <w:sz w:val="20"/>
-          <w:szCs w:val="20"/>
-        </w:rPr>
-        <w:t>Jail.</w:t>
-      </w:r>
-      <w:r>
-        <w:rPr>
-          <w:rFonts w:ascii="Palatino Linotype" w:hAnsi="Palatino Linotype"/>
-          <w:sz w:val="20"/>
-          <w:szCs w:val="20"/>
-        </w:rPr>
-        <w:t xml:space="preserve"> The Defendant is sentenced to </w:t>
-      </w:r>
-      <w:r>
-        <w:rPr>
-          <w:rFonts w:ascii="Palatino Linotype" w:hAnsi="Palatino Linotype"/>
-          <w:b/>
-          <w:bCs/>
-          <w:sz w:val="20"/>
-          <w:szCs w:val="20"/>
-        </w:rPr>
-        <w:t xml:space="preserve">{{ </w:t>
-      </w:r>
-      <w:r>
-        <w:rPr>
-          <w:rFonts w:ascii="Palatino Linotype" w:hAnsi="Palatino Linotype"/>
-          <w:b/>
-          <w:bCs/>
-          <w:sz w:val="20"/>
-          <w:szCs w:val="20"/>
-        </w:rPr>
-        <w:t>jail_terms.</w:t>
-      </w:r>
-      <w:r>
-        <w:rPr>
-          <w:rFonts w:ascii="Palatino Linotype" w:hAnsi="Palatino Linotype"/>
-          <w:b/>
-          <w:bCs/>
-          <w:sz w:val="20"/>
-          <w:szCs w:val="20"/>
-        </w:rPr>
-        <w:t>total_jail_days_to_serve }} days</w:t>
-      </w:r>
-      <w:r>
-        <w:rPr>
-          <w:rFonts w:ascii="Palatino Linotype" w:hAnsi="Palatino Linotype"/>
-          <w:sz w:val="20"/>
-          <w:szCs w:val="20"/>
-        </w:rPr>
-        <w:t xml:space="preserve"> in jail for this case. </w:t>
-      </w:r>
-      <w:r>
-        <w:rPr>
-          <w:rFonts w:ascii="Palatino Linotype" w:hAnsi="Palatino Linotype"/>
-          <w:sz w:val="20"/>
-          <w:szCs w:val="20"/>
-        </w:rPr>
-        <w:t xml:space="preserve">{% if jail_terms.companion_cases_exist is true %}Defendant’s jail days imposed in this case shall be served </w:t>
-      </w:r>
-      <w:r>
-        <w:rPr>
-          <w:rFonts w:ascii="Palatino Linotype" w:hAnsi="Palatino Linotype"/>
-          <w:sz w:val="20"/>
-          <w:szCs w:val="20"/>
-          <w:u w:val="single"/>
-        </w:rPr>
-        <w:t>{{ jail_terms.companion_cases_sentence_type }} to the jail days imposed in {{ jail_terms.companion_cases_numbers }}</w:t>
-      </w:r>
-      <w:r>
-        <w:rPr>
-          <w:rFonts w:ascii="Palatino Linotype" w:hAnsi="Palatino Linotype"/>
-          <w:sz w:val="20"/>
-          <w:szCs w:val="20"/>
-        </w:rPr>
-        <w:t>.</w:t>
-      </w:r>
-      <w:r>
-        <w:rPr>
-          <w:rFonts w:ascii="Palatino Linotype" w:hAnsi="Palatino Linotype"/>
-          <w:sz w:val="20"/>
-          <w:szCs w:val="20"/>
-        </w:rPr>
-        <w:t xml:space="preserve"> </w:t>
-      </w:r>
-      <w:r>
-        <w:rPr>
-          <w:rFonts w:ascii="Palatino Linotype" w:hAnsi="Palatino Linotype"/>
-          <w:sz w:val="20"/>
-          <w:szCs w:val="20"/>
-        </w:rPr>
-        <w:t>{% endif %}</w:t>
-      </w:r>
-      <w:r>
-        <w:rPr>
-          <w:rFonts w:ascii="Palatino Linotype" w:hAnsi="Palatino Linotype"/>
-          <w:sz w:val="20"/>
-          <w:szCs w:val="20"/>
-        </w:rPr>
-        <w:t xml:space="preserve">{% if jail_terms.apply_jtc == ‘Sentence’ %}Defendant is granted </w:t>
-      </w:r>
-      <w:r>
-        <w:rPr>
-          <w:rFonts w:ascii="Palatino Linotype" w:hAnsi="Palatino Linotype"/>
-          <w:b/>
-          <w:sz w:val="20"/>
-          <w:szCs w:val="20"/>
-        </w:rPr>
-        <w:t>credit for {{ jail_terms.days_in_jail }}</w:t>
-      </w:r>
-      <w:r>
-        <w:rPr>
-          <w:rFonts w:ascii="Palatino Linotype" w:hAnsi="Palatino Linotype"/>
-          <w:b/>
-          <w:sz w:val="20"/>
-          <w:szCs w:val="20"/>
-        </w:rPr>
-        <w:t xml:space="preserve"> days</w:t>
-      </w:r>
-      <w:r>
-        <w:rPr>
-          <w:rFonts w:ascii="Palatino Linotype" w:hAnsi="Palatino Linotype"/>
-          <w:sz w:val="20"/>
-          <w:szCs w:val="20"/>
-        </w:rPr>
-        <w:t xml:space="preserve"> already served in jail. {% endif %}{{‘\n\n’}}</w:t>
-      </w:r>
-      <w:r>
-        <w:rPr>
-          <w:rFonts w:ascii="Palatino Linotype" w:hAnsi="Palatino Linotype"/>
-          <w:b/>
-          <w:sz w:val="20"/>
-          <w:szCs w:val="20"/>
-        </w:rPr>
-        <w:t xml:space="preserve">Jail Reporting Terms. </w:t>
-      </w:r>
-      <w:r>
-        <w:rPr>
-          <w:rFonts w:ascii="Palatino Linotype" w:hAnsi="Palatino Linotype"/>
-          <w:sz w:val="20"/>
-          <w:szCs w:val="20"/>
-        </w:rPr>
-        <w:t>{% if jail_terms.report_type == ‘forthwith’ %}</w:t>
-      </w:r>
-      <w:r>
-        <w:rPr>
-          <w:rFonts w:ascii="Palatino Linotype" w:hAnsi="Palatino Linotype"/>
-          <w:sz w:val="20"/>
-          <w:szCs w:val="20"/>
-        </w:rPr>
-        <w:t>Defendant shall report to jail {{ jail_terms.report_type</w:t>
-      </w:r>
-      <w:r>
-        <w:rPr>
-          <w:rFonts w:ascii="Palatino Linotype" w:hAnsi="Palatino Linotype"/>
-          <w:sz w:val="20"/>
-          <w:szCs w:val="20"/>
-        </w:rPr>
-        <w:t xml:space="preserve"> }}.{% endif %}{% if jail_terms.report_type == ‘future date’ %}Defendant’s report date is </w:t>
-      </w:r>
-      <w:r>
-        <w:rPr>
-          <w:rFonts w:ascii="Palatino Linotype" w:hAnsi="Palatino Linotype"/>
-          <w:b/>
-          <w:sz w:val="20"/>
-          <w:szCs w:val="20"/>
-        </w:rPr>
-        <w:t>{{ jail_terms.report_date }}</w:t>
-      </w:r>
-      <w:r>
-        <w:rPr>
-          <w:rFonts w:ascii="Palatino Linotype" w:hAnsi="Palatino Linotype"/>
-          <w:b/>
-          <w:sz w:val="20"/>
-          <w:szCs w:val="20"/>
-        </w:rPr>
-        <w:t>, at {{ jail_terms.report_time }}</w:t>
-      </w:r>
-      <w:r>
-        <w:rPr>
-          <w:rFonts w:ascii="Palatino Linotype" w:hAnsi="Palatino Linotype"/>
-          <w:sz w:val="20"/>
-          <w:szCs w:val="20"/>
-        </w:rPr>
-        <w:t>.{% endif %}{% if jail_terms.report_type == ‘date set by Office of Community Control’ %}Defendant shall schedule the jail days imposed in this case through the Office of Community Control.{% endif %}</w:t>
+        <w:t>is true %}Defendant’s jail days imposed in this case shall be served {{ jail_terms.companion_cases_sentence_type }} to the jail days imposed in {{ jail_terms.companion_cases_numbers }}. {% endif %}</w:t>
       </w:r>
     </w:p>
     <w:p>
@@ -3798,6 +3791,16 @@
           <w:szCs w:val="20"/>
         </w:rPr>
       </w:pPr>
+    </w:p>
+    <w:p>
+      <w:pPr>
+        <w:jc w:val="both"/>
+        <w:rPr>
+          <w:rFonts w:ascii="Palatino Linotype" w:hAnsi="Palatino Linotype"/>
+          <w:sz w:val="20"/>
+          <w:szCs w:val="20"/>
+        </w:rPr>
+      </w:pPr>
       <w:r>
         <w:rPr>
           <w:rFonts w:ascii="Palatino Linotype" w:hAnsi="Palatino Linotype"/>
@@ -4949,16 +4952,7 @@
           <w:sz w:val="20"/>
           <w:szCs w:val="20"/>
         </w:rPr>
-        <w:t xml:space="preserve">driving </w:t>
-      </w:r>
-      <w:r>
-        <w:rPr>
-          <w:rFonts w:ascii="Palatino Linotype" w:hAnsi="Palatino Linotype"/>
-          <w:sz w:val="20"/>
-          <w:szCs w:val="20"/>
-        </w:rPr>
-        <w:lastRenderedPageBreak/>
-        <w:t>privileges, Defendant shall only operate vehicles equipped with a certified ignition interlock device.</w:t>
+        <w:t>driving privileges, Defendant shall only operate vehicles equipped with a certified ignition interlock device.</w:t>
       </w:r>
       <w:r>
         <w:rPr>
@@ -5120,7 +5114,16 @@
           <w:sz w:val="20"/>
           <w:szCs w:val="20"/>
         </w:rPr>
-        <w:t xml:space="preserve">The Clerk shall serve the prosecutor who shall notify the victim as required by R.C. 2930.01-19. </w:t>
+        <w:t xml:space="preserve">The Clerk shall serve the prosecutor who shall notify the </w:t>
+      </w:r>
+      <w:r>
+        <w:rPr>
+          <w:rFonts w:ascii="Palatino Linotype" w:hAnsi="Palatino Linotype"/>
+          <w:sz w:val="20"/>
+          <w:szCs w:val="20"/>
+        </w:rPr>
+        <w:lastRenderedPageBreak/>
+        <w:t xml:space="preserve">victim as required by R.C. 2930.01-19. </w:t>
       </w:r>
       <w:r>
         <w:rPr>
@@ -6336,7 +6339,6 @@
           <w:sz w:val="20"/>
           <w:szCs w:val="20"/>
         </w:rPr>
-        <w:lastRenderedPageBreak/>
         <w:t>Within 90 days provide proof of completion of</w:t>
       </w:r>
       <w:r>
@@ -6554,6 +6556,7 @@
           <w:sz w:val="20"/>
           <w:szCs w:val="20"/>
         </w:rPr>
+        <w:lastRenderedPageBreak/>
         <w:t>Within 90 days provide proof of completion of</w:t>
       </w:r>
       <w:r>
@@ -7600,7 +7603,6 @@
           <w:sz w:val="20"/>
           <w:szCs w:val="20"/>
         </w:rPr>
-        <w:lastRenderedPageBreak/>
         <w:t xml:space="preserve">Other Community Control Conditions: </w:t>
       </w:r>
       <w:r>
@@ -8040,6 +8042,7 @@
           <w:sz w:val="19"/>
           <w:szCs w:val="19"/>
         </w:rPr>
+        <w:lastRenderedPageBreak/>
         <w:t xml:space="preserve">Pursuant to Criminal Rule 19(D) and Traffic Rule 14, written objections to this magistrate’s decision must be filed within </w:t>
       </w:r>
       <w:r>
@@ -8280,7 +8283,7 @@
 </file>
 
 <file path=word/endnotes.xml><?xml version="1.0" encoding="utf-8"?>
-<w:endnotes xmlns:wpc="http://schemas.microsoft.com/office/word/2010/wordprocessingCanvas" xmlns:cx="http://schemas.microsoft.com/office/drawing/2014/chartex" xmlns:cx1="http://schemas.microsoft.com/office/drawing/2015/9/8/chartex" xmlns:cx2="http://schemas.microsoft.com/office/drawing/2015/10/21/chartex" xmlns:cx3="http://schemas.microsoft.com/office/drawing/2016/5/9/chartex" xmlns:cx4="http://schemas.microsoft.com/office/drawing/2016/5/10/chartex" xmlns:cx5="http://schemas.microsoft.com/office/drawing/2016/5/11/chartex" xmlns:cx6="http://schemas.microsoft.com/office/drawing/2016/5/12/chartex" xmlns:cx7="http://schemas.microsoft.com/office/drawing/2016/5/13/chartex" xmlns:cx8="http://schemas.microsoft.com/office/drawing/2016/5/14/chartex" xmlns:mc="http://schemas.openxmlformats.org/markup-compatibility/2006" xmlns:aink="http://schemas.microsoft.com/office/drawing/2016/ink" xmlns:am3d="http://schemas.microsoft.com/office/drawing/2017/model3d" xmlns:o="urn:schemas-microsoft-com:office:office" xmlns:oel="http://schemas.microsoft.com/office/2019/extlst" xmlns:r="http://schemas.openxmlformats.org/officeDocument/2006/relationships" xmlns:m="http://schemas.openxmlformats.org/officeDocument/2006/math" xmlns:v="urn:schemas-microsoft-com:vml" xmlns:wp14="http://schemas.microsoft.com/office/word/2010/wordprocessingDrawing" xmlns:wp="http://schemas.openxmlformats.org/drawingml/2006/wordprocessingDrawing" xmlns:w10="urn:schemas-microsoft-com:office:word" xmlns:w="http://schemas.openxmlformats.org/wordprocessingml/2006/main" xmlns:w14="http://schemas.microsoft.com/office/word/2010/wordml" xmlns:w15="http://schemas.microsoft.com/office/word/2012/wordml" xmlns:w16cex="http://schemas.microsoft.com/office/word/2018/wordml/cex" xmlns:w16cid="http://schemas.microsoft.com/office/word/2016/wordml/cid" xmlns:w16="http://schemas.microsoft.com/office/word/2018/wordml" xmlns:w16du="http://schemas.microsoft.com/office/word/2023/wordml/word16du" xmlns:w16sdtdh="http://schemas.microsoft.com/office/word/2020/wordml/sdtdatahash" xmlns:w16se="http://schemas.microsoft.com/office/word/2015/wordml/symex" xmlns:wpg="http://schemas.microsoft.com/office/word/2010/wordprocessingGroup" xmlns:wpi="http://schemas.microsoft.com/office/word/2010/wordprocessingInk" xmlns:wne="http://schemas.microsoft.com/office/word/2006/wordml" xmlns:wps="http://schemas.microsoft.com/office/word/2010/wordprocessingShape" mc:Ignorable="w14 w15 w16se w16cid w16 w16cex w16sdtdh wp14">
+<w:endnotes xmlns:wpc="http://schemas.microsoft.com/office/word/2010/wordprocessingCanvas" xmlns:cx="http://schemas.microsoft.com/office/drawing/2014/chartex" xmlns:cx1="http://schemas.microsoft.com/office/drawing/2015/9/8/chartex" xmlns:cx2="http://schemas.microsoft.com/office/drawing/2015/10/21/chartex" xmlns:cx3="http://schemas.microsoft.com/office/drawing/2016/5/9/chartex" xmlns:cx4="http://schemas.microsoft.com/office/drawing/2016/5/10/chartex" xmlns:cx5="http://schemas.microsoft.com/office/drawing/2016/5/11/chartex" xmlns:cx6="http://schemas.microsoft.com/office/drawing/2016/5/12/chartex" xmlns:cx7="http://schemas.microsoft.com/office/drawing/2016/5/13/chartex" xmlns:cx8="http://schemas.microsoft.com/office/drawing/2016/5/14/chartex" xmlns:mc="http://schemas.openxmlformats.org/markup-compatibility/2006" xmlns:aink="http://schemas.microsoft.com/office/drawing/2016/ink" xmlns:am3d="http://schemas.microsoft.com/office/drawing/2017/model3d" xmlns:o="urn:schemas-microsoft-com:office:office" xmlns:oel="http://schemas.microsoft.com/office/2019/extlst" xmlns:r="http://schemas.openxmlformats.org/officeDocument/2006/relationships" xmlns:m="http://schemas.openxmlformats.org/officeDocument/2006/math" xmlns:v="urn:schemas-microsoft-com:vml" xmlns:wp14="http://schemas.microsoft.com/office/word/2010/wordprocessingDrawing" xmlns:wp="http://schemas.openxmlformats.org/drawingml/2006/wordprocessingDrawing" xmlns:w10="urn:schemas-microsoft-com:office:word" xmlns:w="http://schemas.openxmlformats.org/wordprocessingml/2006/main" xmlns:w14="http://schemas.microsoft.com/office/word/2010/wordml" xmlns:w15="http://schemas.microsoft.com/office/word/2012/wordml" xmlns:w16cex="http://schemas.microsoft.com/office/word/2018/wordml/cex" xmlns:w16cid="http://schemas.microsoft.com/office/word/2016/wordml/cid" xmlns:w16="http://schemas.microsoft.com/office/word/2018/wordml" xmlns:w16sdtdh="http://schemas.microsoft.com/office/word/2020/wordml/sdtdatahash" xmlns:w16se="http://schemas.microsoft.com/office/word/2015/wordml/symex" xmlns:wpg="http://schemas.microsoft.com/office/word/2010/wordprocessingGroup" xmlns:wpi="http://schemas.microsoft.com/office/word/2010/wordprocessingInk" xmlns:wne="http://schemas.microsoft.com/office/word/2006/wordml" xmlns:wps="http://schemas.microsoft.com/office/word/2010/wordprocessingShape" mc:Ignorable="w14 w15 w16se w16cid w16 w16cex w16sdtdh wp14">
   <w:endnote w:type="separator" w:id="-1">
     <w:p>
       <w:r>
@@ -8299,7 +8302,7 @@
 </file>
 
 <file path=word/footer1.xml><?xml version="1.0" encoding="utf-8"?>
-<w:ftr xmlns:wpc="http://schemas.microsoft.com/office/word/2010/wordprocessingCanvas" xmlns:cx="http://schemas.microsoft.com/office/drawing/2014/chartex" xmlns:cx1="http://schemas.microsoft.com/office/drawing/2015/9/8/chartex" xmlns:cx2="http://schemas.microsoft.com/office/drawing/2015/10/21/chartex" xmlns:cx3="http://schemas.microsoft.com/office/drawing/2016/5/9/chartex" xmlns:cx4="http://schemas.microsoft.com/office/drawing/2016/5/10/chartex" xmlns:cx5="http://schemas.microsoft.com/office/drawing/2016/5/11/chartex" xmlns:cx6="http://schemas.microsoft.com/office/drawing/2016/5/12/chartex" xmlns:cx7="http://schemas.microsoft.com/office/drawing/2016/5/13/chartex" xmlns:cx8="http://schemas.microsoft.com/office/drawing/2016/5/14/chartex" xmlns:mc="http://schemas.openxmlformats.org/markup-compatibility/2006" xmlns:aink="http://schemas.microsoft.com/office/drawing/2016/ink" xmlns:am3d="http://schemas.microsoft.com/office/drawing/2017/model3d" xmlns:o="urn:schemas-microsoft-com:office:office" xmlns:oel="http://schemas.microsoft.com/office/2019/extlst" xmlns:r="http://schemas.openxmlformats.org/officeDocument/2006/relationships" xmlns:m="http://schemas.openxmlformats.org/officeDocument/2006/math" xmlns:v="urn:schemas-microsoft-com:vml" xmlns:wp14="http://schemas.microsoft.com/office/word/2010/wordprocessingDrawing" xmlns:wp="http://schemas.openxmlformats.org/drawingml/2006/wordprocessingDrawing" xmlns:w10="urn:schemas-microsoft-com:office:word" xmlns:w="http://schemas.openxmlformats.org/wordprocessingml/2006/main" xmlns:w14="http://schemas.microsoft.com/office/word/2010/wordml" xmlns:w15="http://schemas.microsoft.com/office/word/2012/wordml" xmlns:w16cex="http://schemas.microsoft.com/office/word/2018/wordml/cex" xmlns:w16cid="http://schemas.microsoft.com/office/word/2016/wordml/cid" xmlns:w16="http://schemas.microsoft.com/office/word/2018/wordml" xmlns:w16du="http://schemas.microsoft.com/office/word/2023/wordml/word16du" xmlns:w16sdtdh="http://schemas.microsoft.com/office/word/2020/wordml/sdtdatahash" xmlns:w16se="http://schemas.microsoft.com/office/word/2015/wordml/symex" xmlns:wpg="http://schemas.microsoft.com/office/word/2010/wordprocessingGroup" xmlns:wpi="http://schemas.microsoft.com/office/word/2010/wordprocessingInk" xmlns:wne="http://schemas.microsoft.com/office/word/2006/wordml" xmlns:wps="http://schemas.microsoft.com/office/word/2010/wordprocessingShape" mc:Ignorable="w14 w15 w16se w16cid w16 w16cex w16sdtdh wp14">
+<w:ftr xmlns:wpc="http://schemas.microsoft.com/office/word/2010/wordprocessingCanvas" xmlns:cx="http://schemas.microsoft.com/office/drawing/2014/chartex" xmlns:cx1="http://schemas.microsoft.com/office/drawing/2015/9/8/chartex" xmlns:cx2="http://schemas.microsoft.com/office/drawing/2015/10/21/chartex" xmlns:cx3="http://schemas.microsoft.com/office/drawing/2016/5/9/chartex" xmlns:cx4="http://schemas.microsoft.com/office/drawing/2016/5/10/chartex" xmlns:cx5="http://schemas.microsoft.com/office/drawing/2016/5/11/chartex" xmlns:cx6="http://schemas.microsoft.com/office/drawing/2016/5/12/chartex" xmlns:cx7="http://schemas.microsoft.com/office/drawing/2016/5/13/chartex" xmlns:cx8="http://schemas.microsoft.com/office/drawing/2016/5/14/chartex" xmlns:mc="http://schemas.openxmlformats.org/markup-compatibility/2006" xmlns:aink="http://schemas.microsoft.com/office/drawing/2016/ink" xmlns:am3d="http://schemas.microsoft.com/office/drawing/2017/model3d" xmlns:o="urn:schemas-microsoft-com:office:office" xmlns:oel="http://schemas.microsoft.com/office/2019/extlst" xmlns:r="http://schemas.openxmlformats.org/officeDocument/2006/relationships" xmlns:m="http://schemas.openxmlformats.org/officeDocument/2006/math" xmlns:v="urn:schemas-microsoft-com:vml" xmlns:wp14="http://schemas.microsoft.com/office/word/2010/wordprocessingDrawing" xmlns:wp="http://schemas.openxmlformats.org/drawingml/2006/wordprocessingDrawing" xmlns:w10="urn:schemas-microsoft-com:office:word" xmlns:w="http://schemas.openxmlformats.org/wordprocessingml/2006/main" xmlns:w14="http://schemas.microsoft.com/office/word/2010/wordml" xmlns:w15="http://schemas.microsoft.com/office/word/2012/wordml" xmlns:w16cex="http://schemas.microsoft.com/office/word/2018/wordml/cex" xmlns:w16cid="http://schemas.microsoft.com/office/word/2016/wordml/cid" xmlns:w16="http://schemas.microsoft.com/office/word/2018/wordml" xmlns:w16sdtdh="http://schemas.microsoft.com/office/word/2020/wordml/sdtdatahash" xmlns:w16se="http://schemas.microsoft.com/office/word/2015/wordml/symex" xmlns:wpg="http://schemas.microsoft.com/office/word/2010/wordprocessingGroup" xmlns:wpi="http://schemas.microsoft.com/office/word/2010/wordprocessingInk" xmlns:wne="http://schemas.microsoft.com/office/word/2006/wordml" xmlns:wps="http://schemas.microsoft.com/office/word/2010/wordprocessingShape" mc:Ignorable="w14 w15 w16se w16cid w16 w16cex w16sdtdh wp14">
   <w:p>
     <w:pPr>
       <w:pStyle w:val="Footer"/>
@@ -8309,7 +8312,7 @@
 </file>
 
 <file path=word/footer2.xml><?xml version="1.0" encoding="utf-8"?>
-<w:ftr xmlns:wpc="http://schemas.microsoft.com/office/word/2010/wordprocessingCanvas" xmlns:cx="http://schemas.microsoft.com/office/drawing/2014/chartex" xmlns:cx1="http://schemas.microsoft.com/office/drawing/2015/9/8/chartex" xmlns:cx2="http://schemas.microsoft.com/office/drawing/2015/10/21/chartex" xmlns:cx3="http://schemas.microsoft.com/office/drawing/2016/5/9/chartex" xmlns:cx4="http://schemas.microsoft.com/office/drawing/2016/5/10/chartex" xmlns:cx5="http://schemas.microsoft.com/office/drawing/2016/5/11/chartex" xmlns:cx6="http://schemas.microsoft.com/office/drawing/2016/5/12/chartex" xmlns:cx7="http://schemas.microsoft.com/office/drawing/2016/5/13/chartex" xmlns:cx8="http://schemas.microsoft.com/office/drawing/2016/5/14/chartex" xmlns:mc="http://schemas.openxmlformats.org/markup-compatibility/2006" xmlns:aink="http://schemas.microsoft.com/office/drawing/2016/ink" xmlns:am3d="http://schemas.microsoft.com/office/drawing/2017/model3d" xmlns:o="urn:schemas-microsoft-com:office:office" xmlns:oel="http://schemas.microsoft.com/office/2019/extlst" xmlns:r="http://schemas.openxmlformats.org/officeDocument/2006/relationships" xmlns:m="http://schemas.openxmlformats.org/officeDocument/2006/math" xmlns:v="urn:schemas-microsoft-com:vml" xmlns:wp14="http://schemas.microsoft.com/office/word/2010/wordprocessingDrawing" xmlns:wp="http://schemas.openxmlformats.org/drawingml/2006/wordprocessingDrawing" xmlns:w10="urn:schemas-microsoft-com:office:word" xmlns:w="http://schemas.openxmlformats.org/wordprocessingml/2006/main" xmlns:w14="http://schemas.microsoft.com/office/word/2010/wordml" xmlns:w15="http://schemas.microsoft.com/office/word/2012/wordml" xmlns:w16cex="http://schemas.microsoft.com/office/word/2018/wordml/cex" xmlns:w16cid="http://schemas.microsoft.com/office/word/2016/wordml/cid" xmlns:w16="http://schemas.microsoft.com/office/word/2018/wordml" xmlns:w16du="http://schemas.microsoft.com/office/word/2023/wordml/word16du" xmlns:w16sdtdh="http://schemas.microsoft.com/office/word/2020/wordml/sdtdatahash" xmlns:w16se="http://schemas.microsoft.com/office/word/2015/wordml/symex" xmlns:wpg="http://schemas.microsoft.com/office/word/2010/wordprocessingGroup" xmlns:wpi="http://schemas.microsoft.com/office/word/2010/wordprocessingInk" xmlns:wne="http://schemas.microsoft.com/office/word/2006/wordml" xmlns:wps="http://schemas.microsoft.com/office/word/2010/wordprocessingShape" mc:Ignorable="w14 w15 w16se w16cid w16 w16cex w16sdtdh wp14">
+<w:ftr xmlns:wpc="http://schemas.microsoft.com/office/word/2010/wordprocessingCanvas" xmlns:cx="http://schemas.microsoft.com/office/drawing/2014/chartex" xmlns:cx1="http://schemas.microsoft.com/office/drawing/2015/9/8/chartex" xmlns:cx2="http://schemas.microsoft.com/office/drawing/2015/10/21/chartex" xmlns:cx3="http://schemas.microsoft.com/office/drawing/2016/5/9/chartex" xmlns:cx4="http://schemas.microsoft.com/office/drawing/2016/5/10/chartex" xmlns:cx5="http://schemas.microsoft.com/office/drawing/2016/5/11/chartex" xmlns:cx6="http://schemas.microsoft.com/office/drawing/2016/5/12/chartex" xmlns:cx7="http://schemas.microsoft.com/office/drawing/2016/5/13/chartex" xmlns:cx8="http://schemas.microsoft.com/office/drawing/2016/5/14/chartex" xmlns:mc="http://schemas.openxmlformats.org/markup-compatibility/2006" xmlns:aink="http://schemas.microsoft.com/office/drawing/2016/ink" xmlns:am3d="http://schemas.microsoft.com/office/drawing/2017/model3d" xmlns:o="urn:schemas-microsoft-com:office:office" xmlns:oel="http://schemas.microsoft.com/office/2019/extlst" xmlns:r="http://schemas.openxmlformats.org/officeDocument/2006/relationships" xmlns:m="http://schemas.openxmlformats.org/officeDocument/2006/math" xmlns:v="urn:schemas-microsoft-com:vml" xmlns:wp14="http://schemas.microsoft.com/office/word/2010/wordprocessingDrawing" xmlns:wp="http://schemas.openxmlformats.org/drawingml/2006/wordprocessingDrawing" xmlns:w10="urn:schemas-microsoft-com:office:word" xmlns:w="http://schemas.openxmlformats.org/wordprocessingml/2006/main" xmlns:w14="http://schemas.microsoft.com/office/word/2010/wordml" xmlns:w15="http://schemas.microsoft.com/office/word/2012/wordml" xmlns:w16cex="http://schemas.microsoft.com/office/word/2018/wordml/cex" xmlns:w16cid="http://schemas.microsoft.com/office/word/2016/wordml/cid" xmlns:w16="http://schemas.microsoft.com/office/word/2018/wordml" xmlns:w16sdtdh="http://schemas.microsoft.com/office/word/2020/wordml/sdtdatahash" xmlns:w16se="http://schemas.microsoft.com/office/word/2015/wordml/symex" xmlns:wpg="http://schemas.microsoft.com/office/word/2010/wordprocessingGroup" xmlns:wpi="http://schemas.microsoft.com/office/word/2010/wordprocessingInk" xmlns:wne="http://schemas.microsoft.com/office/word/2006/wordml" xmlns:wps="http://schemas.microsoft.com/office/word/2010/wordprocessingShape" mc:Ignorable="w14 w15 w16se w16cid w16 w16cex w16sdtdh wp14">
   <w:sdt>
     <w:sdtPr>
       <w:rPr>
@@ -8521,7 +8524,7 @@
 </file>
 
 <file path=word/footer3.xml><?xml version="1.0" encoding="utf-8"?>
-<w:ftr xmlns:wpc="http://schemas.microsoft.com/office/word/2010/wordprocessingCanvas" xmlns:cx="http://schemas.microsoft.com/office/drawing/2014/chartex" xmlns:cx1="http://schemas.microsoft.com/office/drawing/2015/9/8/chartex" xmlns:cx2="http://schemas.microsoft.com/office/drawing/2015/10/21/chartex" xmlns:cx3="http://schemas.microsoft.com/office/drawing/2016/5/9/chartex" xmlns:cx4="http://schemas.microsoft.com/office/drawing/2016/5/10/chartex" xmlns:cx5="http://schemas.microsoft.com/office/drawing/2016/5/11/chartex" xmlns:cx6="http://schemas.microsoft.com/office/drawing/2016/5/12/chartex" xmlns:cx7="http://schemas.microsoft.com/office/drawing/2016/5/13/chartex" xmlns:cx8="http://schemas.microsoft.com/office/drawing/2016/5/14/chartex" xmlns:mc="http://schemas.openxmlformats.org/markup-compatibility/2006" xmlns:aink="http://schemas.microsoft.com/office/drawing/2016/ink" xmlns:am3d="http://schemas.microsoft.com/office/drawing/2017/model3d" xmlns:o="urn:schemas-microsoft-com:office:office" xmlns:oel="http://schemas.microsoft.com/office/2019/extlst" xmlns:r="http://schemas.openxmlformats.org/officeDocument/2006/relationships" xmlns:m="http://schemas.openxmlformats.org/officeDocument/2006/math" xmlns:v="urn:schemas-microsoft-com:vml" xmlns:wp14="http://schemas.microsoft.com/office/word/2010/wordprocessingDrawing" xmlns:wp="http://schemas.openxmlformats.org/drawingml/2006/wordprocessingDrawing" xmlns:w10="urn:schemas-microsoft-com:office:word" xmlns:w="http://schemas.openxmlformats.org/wordprocessingml/2006/main" xmlns:w14="http://schemas.microsoft.com/office/word/2010/wordml" xmlns:w15="http://schemas.microsoft.com/office/word/2012/wordml" xmlns:w16cex="http://schemas.microsoft.com/office/word/2018/wordml/cex" xmlns:w16cid="http://schemas.microsoft.com/office/word/2016/wordml/cid" xmlns:w16="http://schemas.microsoft.com/office/word/2018/wordml" xmlns:w16du="http://schemas.microsoft.com/office/word/2023/wordml/word16du" xmlns:w16sdtdh="http://schemas.microsoft.com/office/word/2020/wordml/sdtdatahash" xmlns:w16se="http://schemas.microsoft.com/office/word/2015/wordml/symex" xmlns:wpg="http://schemas.microsoft.com/office/word/2010/wordprocessingGroup" xmlns:wpi="http://schemas.microsoft.com/office/word/2010/wordprocessingInk" xmlns:wne="http://schemas.microsoft.com/office/word/2006/wordml" xmlns:wps="http://schemas.microsoft.com/office/word/2010/wordprocessingShape" mc:Ignorable="w14 w15 w16se w16cid w16 w16cex w16sdtdh wp14">
+<w:ftr xmlns:wpc="http://schemas.microsoft.com/office/word/2010/wordprocessingCanvas" xmlns:cx="http://schemas.microsoft.com/office/drawing/2014/chartex" xmlns:cx1="http://schemas.microsoft.com/office/drawing/2015/9/8/chartex" xmlns:cx2="http://schemas.microsoft.com/office/drawing/2015/10/21/chartex" xmlns:cx3="http://schemas.microsoft.com/office/drawing/2016/5/9/chartex" xmlns:cx4="http://schemas.microsoft.com/office/drawing/2016/5/10/chartex" xmlns:cx5="http://schemas.microsoft.com/office/drawing/2016/5/11/chartex" xmlns:cx6="http://schemas.microsoft.com/office/drawing/2016/5/12/chartex" xmlns:cx7="http://schemas.microsoft.com/office/drawing/2016/5/13/chartex" xmlns:cx8="http://schemas.microsoft.com/office/drawing/2016/5/14/chartex" xmlns:mc="http://schemas.openxmlformats.org/markup-compatibility/2006" xmlns:aink="http://schemas.microsoft.com/office/drawing/2016/ink" xmlns:am3d="http://schemas.microsoft.com/office/drawing/2017/model3d" xmlns:o="urn:schemas-microsoft-com:office:office" xmlns:oel="http://schemas.microsoft.com/office/2019/extlst" xmlns:r="http://schemas.openxmlformats.org/officeDocument/2006/relationships" xmlns:m="http://schemas.openxmlformats.org/officeDocument/2006/math" xmlns:v="urn:schemas-microsoft-com:vml" xmlns:wp14="http://schemas.microsoft.com/office/word/2010/wordprocessingDrawing" xmlns:wp="http://schemas.openxmlformats.org/drawingml/2006/wordprocessingDrawing" xmlns:w10="urn:schemas-microsoft-com:office:word" xmlns:w="http://schemas.openxmlformats.org/wordprocessingml/2006/main" xmlns:w14="http://schemas.microsoft.com/office/word/2010/wordml" xmlns:w15="http://schemas.microsoft.com/office/word/2012/wordml" xmlns:w16cex="http://schemas.microsoft.com/office/word/2018/wordml/cex" xmlns:w16cid="http://schemas.microsoft.com/office/word/2016/wordml/cid" xmlns:w16="http://schemas.microsoft.com/office/word/2018/wordml" xmlns:w16sdtdh="http://schemas.microsoft.com/office/word/2020/wordml/sdtdatahash" xmlns:w16se="http://schemas.microsoft.com/office/word/2015/wordml/symex" xmlns:wpg="http://schemas.microsoft.com/office/word/2010/wordprocessingGroup" xmlns:wpi="http://schemas.microsoft.com/office/word/2010/wordprocessingInk" xmlns:wne="http://schemas.microsoft.com/office/word/2006/wordml" xmlns:wps="http://schemas.microsoft.com/office/word/2010/wordprocessingShape" mc:Ignorable="w14 w15 w16se w16cid w16 w16cex w16sdtdh wp14">
   <w:p>
     <w:pPr>
       <w:pStyle w:val="Footer"/>
@@ -8531,7 +8534,7 @@
 </file>
 
 <file path=word/footnotes.xml><?xml version="1.0" encoding="utf-8"?>
-<w:footnotes xmlns:wpc="http://schemas.microsoft.com/office/word/2010/wordprocessingCanvas" xmlns:cx="http://schemas.microsoft.com/office/drawing/2014/chartex" xmlns:cx1="http://schemas.microsoft.com/office/drawing/2015/9/8/chartex" xmlns:cx2="http://schemas.microsoft.com/office/drawing/2015/10/21/chartex" xmlns:cx3="http://schemas.microsoft.com/office/drawing/2016/5/9/chartex" xmlns:cx4="http://schemas.microsoft.com/office/drawing/2016/5/10/chartex" xmlns:cx5="http://schemas.microsoft.com/office/drawing/2016/5/11/chartex" xmlns:cx6="http://schemas.microsoft.com/office/drawing/2016/5/12/chartex" xmlns:cx7="http://schemas.microsoft.com/office/drawing/2016/5/13/chartex" xmlns:cx8="http://schemas.microsoft.com/office/drawing/2016/5/14/chartex" xmlns:mc="http://schemas.openxmlformats.org/markup-compatibility/2006" xmlns:aink="http://schemas.microsoft.com/office/drawing/2016/ink" xmlns:am3d="http://schemas.microsoft.com/office/drawing/2017/model3d" xmlns:o="urn:schemas-microsoft-com:office:office" xmlns:oel="http://schemas.microsoft.com/office/2019/extlst" xmlns:r="http://schemas.openxmlformats.org/officeDocument/2006/relationships" xmlns:m="http://schemas.openxmlformats.org/officeDocument/2006/math" xmlns:v="urn:schemas-microsoft-com:vml" xmlns:wp14="http://schemas.microsoft.com/office/word/2010/wordprocessingDrawing" xmlns:wp="http://schemas.openxmlformats.org/drawingml/2006/wordprocessingDrawing" xmlns:w10="urn:schemas-microsoft-com:office:word" xmlns:w="http://schemas.openxmlformats.org/wordprocessingml/2006/main" xmlns:w14="http://schemas.microsoft.com/office/word/2010/wordml" xmlns:w15="http://schemas.microsoft.com/office/word/2012/wordml" xmlns:w16cex="http://schemas.microsoft.com/office/word/2018/wordml/cex" xmlns:w16cid="http://schemas.microsoft.com/office/word/2016/wordml/cid" xmlns:w16="http://schemas.microsoft.com/office/word/2018/wordml" xmlns:w16du="http://schemas.microsoft.com/office/word/2023/wordml/word16du" xmlns:w16sdtdh="http://schemas.microsoft.com/office/word/2020/wordml/sdtdatahash" xmlns:w16se="http://schemas.microsoft.com/office/word/2015/wordml/symex" xmlns:wpg="http://schemas.microsoft.com/office/word/2010/wordprocessingGroup" xmlns:wpi="http://schemas.microsoft.com/office/word/2010/wordprocessingInk" xmlns:wne="http://schemas.microsoft.com/office/word/2006/wordml" xmlns:wps="http://schemas.microsoft.com/office/word/2010/wordprocessingShape" mc:Ignorable="w14 w15 w16se w16cid w16 w16cex w16sdtdh wp14">
+<w:footnotes xmlns:wpc="http://schemas.microsoft.com/office/word/2010/wordprocessingCanvas" xmlns:cx="http://schemas.microsoft.com/office/drawing/2014/chartex" xmlns:cx1="http://schemas.microsoft.com/office/drawing/2015/9/8/chartex" xmlns:cx2="http://schemas.microsoft.com/office/drawing/2015/10/21/chartex" xmlns:cx3="http://schemas.microsoft.com/office/drawing/2016/5/9/chartex" xmlns:cx4="http://schemas.microsoft.com/office/drawing/2016/5/10/chartex" xmlns:cx5="http://schemas.microsoft.com/office/drawing/2016/5/11/chartex" xmlns:cx6="http://schemas.microsoft.com/office/drawing/2016/5/12/chartex" xmlns:cx7="http://schemas.microsoft.com/office/drawing/2016/5/13/chartex" xmlns:cx8="http://schemas.microsoft.com/office/drawing/2016/5/14/chartex" xmlns:mc="http://schemas.openxmlformats.org/markup-compatibility/2006" xmlns:aink="http://schemas.microsoft.com/office/drawing/2016/ink" xmlns:am3d="http://schemas.microsoft.com/office/drawing/2017/model3d" xmlns:o="urn:schemas-microsoft-com:office:office" xmlns:oel="http://schemas.microsoft.com/office/2019/extlst" xmlns:r="http://schemas.openxmlformats.org/officeDocument/2006/relationships" xmlns:m="http://schemas.openxmlformats.org/officeDocument/2006/math" xmlns:v="urn:schemas-microsoft-com:vml" xmlns:wp14="http://schemas.microsoft.com/office/word/2010/wordprocessingDrawing" xmlns:wp="http://schemas.openxmlformats.org/drawingml/2006/wordprocessingDrawing" xmlns:w10="urn:schemas-microsoft-com:office:word" xmlns:w="http://schemas.openxmlformats.org/wordprocessingml/2006/main" xmlns:w14="http://schemas.microsoft.com/office/word/2010/wordml" xmlns:w15="http://schemas.microsoft.com/office/word/2012/wordml" xmlns:w16cex="http://schemas.microsoft.com/office/word/2018/wordml/cex" xmlns:w16cid="http://schemas.microsoft.com/office/word/2016/wordml/cid" xmlns:w16="http://schemas.microsoft.com/office/word/2018/wordml" xmlns:w16sdtdh="http://schemas.microsoft.com/office/word/2020/wordml/sdtdatahash" xmlns:w16se="http://schemas.microsoft.com/office/word/2015/wordml/symex" xmlns:wpg="http://schemas.microsoft.com/office/word/2010/wordprocessingGroup" xmlns:wpi="http://schemas.microsoft.com/office/word/2010/wordprocessingInk" xmlns:wne="http://schemas.microsoft.com/office/word/2006/wordml" xmlns:wps="http://schemas.microsoft.com/office/word/2010/wordprocessingShape" mc:Ignorable="w14 w15 w16se w16cid w16 w16cex w16sdtdh wp14">
   <w:footnote w:type="separator" w:id="-1">
     <w:p>
       <w:r>
@@ -8550,7 +8553,7 @@
 </file>
 
 <file path=word/header1.xml><?xml version="1.0" encoding="utf-8"?>
-<w:hdr xmlns:wpc="http://schemas.microsoft.com/office/word/2010/wordprocessingCanvas" xmlns:cx="http://schemas.microsoft.com/office/drawing/2014/chartex" xmlns:cx1="http://schemas.microsoft.com/office/drawing/2015/9/8/chartex" xmlns:cx2="http://schemas.microsoft.com/office/drawing/2015/10/21/chartex" xmlns:cx3="http://schemas.microsoft.com/office/drawing/2016/5/9/chartex" xmlns:cx4="http://schemas.microsoft.com/office/drawing/2016/5/10/chartex" xmlns:cx5="http://schemas.microsoft.com/office/drawing/2016/5/11/chartex" xmlns:cx6="http://schemas.microsoft.com/office/drawing/2016/5/12/chartex" xmlns:cx7="http://schemas.microsoft.com/office/drawing/2016/5/13/chartex" xmlns:cx8="http://schemas.microsoft.com/office/drawing/2016/5/14/chartex" xmlns:mc="http://schemas.openxmlformats.org/markup-compatibility/2006" xmlns:aink="http://schemas.microsoft.com/office/drawing/2016/ink" xmlns:am3d="http://schemas.microsoft.com/office/drawing/2017/model3d" xmlns:o="urn:schemas-microsoft-com:office:office" xmlns:oel="http://schemas.microsoft.com/office/2019/extlst" xmlns:r="http://schemas.openxmlformats.org/officeDocument/2006/relationships" xmlns:m="http://schemas.openxmlformats.org/officeDocument/2006/math" xmlns:v="urn:schemas-microsoft-com:vml" xmlns:wp14="http://schemas.microsoft.com/office/word/2010/wordprocessingDrawing" xmlns:wp="http://schemas.openxmlformats.org/drawingml/2006/wordprocessingDrawing" xmlns:w10="urn:schemas-microsoft-com:office:word" xmlns:w="http://schemas.openxmlformats.org/wordprocessingml/2006/main" xmlns:w14="http://schemas.microsoft.com/office/word/2010/wordml" xmlns:w15="http://schemas.microsoft.com/office/word/2012/wordml" xmlns:w16cex="http://schemas.microsoft.com/office/word/2018/wordml/cex" xmlns:w16cid="http://schemas.microsoft.com/office/word/2016/wordml/cid" xmlns:w16="http://schemas.microsoft.com/office/word/2018/wordml" xmlns:w16du="http://schemas.microsoft.com/office/word/2023/wordml/word16du" xmlns:w16sdtdh="http://schemas.microsoft.com/office/word/2020/wordml/sdtdatahash" xmlns:w16se="http://schemas.microsoft.com/office/word/2015/wordml/symex" xmlns:wpg="http://schemas.microsoft.com/office/word/2010/wordprocessingGroup" xmlns:wpi="http://schemas.microsoft.com/office/word/2010/wordprocessingInk" xmlns:wne="http://schemas.microsoft.com/office/word/2006/wordml" xmlns:wps="http://schemas.microsoft.com/office/word/2010/wordprocessingShape" mc:Ignorable="w14 w15 w16se w16cid w16 w16cex w16sdtdh wp14">
+<w:hdr xmlns:wpc="http://schemas.microsoft.com/office/word/2010/wordprocessingCanvas" xmlns:cx="http://schemas.microsoft.com/office/drawing/2014/chartex" xmlns:cx1="http://schemas.microsoft.com/office/drawing/2015/9/8/chartex" xmlns:cx2="http://schemas.microsoft.com/office/drawing/2015/10/21/chartex" xmlns:cx3="http://schemas.microsoft.com/office/drawing/2016/5/9/chartex" xmlns:cx4="http://schemas.microsoft.com/office/drawing/2016/5/10/chartex" xmlns:cx5="http://schemas.microsoft.com/office/drawing/2016/5/11/chartex" xmlns:cx6="http://schemas.microsoft.com/office/drawing/2016/5/12/chartex" xmlns:cx7="http://schemas.microsoft.com/office/drawing/2016/5/13/chartex" xmlns:cx8="http://schemas.microsoft.com/office/drawing/2016/5/14/chartex" xmlns:mc="http://schemas.openxmlformats.org/markup-compatibility/2006" xmlns:aink="http://schemas.microsoft.com/office/drawing/2016/ink" xmlns:am3d="http://schemas.microsoft.com/office/drawing/2017/model3d" xmlns:o="urn:schemas-microsoft-com:office:office" xmlns:oel="http://schemas.microsoft.com/office/2019/extlst" xmlns:r="http://schemas.openxmlformats.org/officeDocument/2006/relationships" xmlns:m="http://schemas.openxmlformats.org/officeDocument/2006/math" xmlns:v="urn:schemas-microsoft-com:vml" xmlns:wp14="http://schemas.microsoft.com/office/word/2010/wordprocessingDrawing" xmlns:wp="http://schemas.openxmlformats.org/drawingml/2006/wordprocessingDrawing" xmlns:w10="urn:schemas-microsoft-com:office:word" xmlns:w="http://schemas.openxmlformats.org/wordprocessingml/2006/main" xmlns:w14="http://schemas.microsoft.com/office/word/2010/wordml" xmlns:w15="http://schemas.microsoft.com/office/word/2012/wordml" xmlns:w16cex="http://schemas.microsoft.com/office/word/2018/wordml/cex" xmlns:w16cid="http://schemas.microsoft.com/office/word/2016/wordml/cid" xmlns:w16="http://schemas.microsoft.com/office/word/2018/wordml" xmlns:w16sdtdh="http://schemas.microsoft.com/office/word/2020/wordml/sdtdatahash" xmlns:w16se="http://schemas.microsoft.com/office/word/2015/wordml/symex" xmlns:wpg="http://schemas.microsoft.com/office/word/2010/wordprocessingGroup" xmlns:wpi="http://schemas.microsoft.com/office/word/2010/wordprocessingInk" xmlns:wne="http://schemas.microsoft.com/office/word/2006/wordml" xmlns:wps="http://schemas.microsoft.com/office/word/2010/wordprocessingShape" mc:Ignorable="w14 w15 w16se w16cid w16 w16cex w16sdtdh wp14">
   <w:p>
     <w:pPr>
       <w:pStyle w:val="Header"/>
@@ -8560,7 +8563,7 @@
 </file>
 
 <file path=word/header2.xml><?xml version="1.0" encoding="utf-8"?>
-<w:hdr xmlns:wpc="http://schemas.microsoft.com/office/word/2010/wordprocessingCanvas" xmlns:cx="http://schemas.microsoft.com/office/drawing/2014/chartex" xmlns:cx1="http://schemas.microsoft.com/office/drawing/2015/9/8/chartex" xmlns:cx2="http://schemas.microsoft.com/office/drawing/2015/10/21/chartex" xmlns:cx3="http://schemas.microsoft.com/office/drawing/2016/5/9/chartex" xmlns:cx4="http://schemas.microsoft.com/office/drawing/2016/5/10/chartex" xmlns:cx5="http://schemas.microsoft.com/office/drawing/2016/5/11/chartex" xmlns:cx6="http://schemas.microsoft.com/office/drawing/2016/5/12/chartex" xmlns:cx7="http://schemas.microsoft.com/office/drawing/2016/5/13/chartex" xmlns:cx8="http://schemas.microsoft.com/office/drawing/2016/5/14/chartex" xmlns:mc="http://schemas.openxmlformats.org/markup-compatibility/2006" xmlns:aink="http://schemas.microsoft.com/office/drawing/2016/ink" xmlns:am3d="http://schemas.microsoft.com/office/drawing/2017/model3d" xmlns:o="urn:schemas-microsoft-com:office:office" xmlns:oel="http://schemas.microsoft.com/office/2019/extlst" xmlns:r="http://schemas.openxmlformats.org/officeDocument/2006/relationships" xmlns:m="http://schemas.openxmlformats.org/officeDocument/2006/math" xmlns:v="urn:schemas-microsoft-com:vml" xmlns:wp14="http://schemas.microsoft.com/office/word/2010/wordprocessingDrawing" xmlns:wp="http://schemas.openxmlformats.org/drawingml/2006/wordprocessingDrawing" xmlns:w10="urn:schemas-microsoft-com:office:word" xmlns:w="http://schemas.openxmlformats.org/wordprocessingml/2006/main" xmlns:w14="http://schemas.microsoft.com/office/word/2010/wordml" xmlns:w15="http://schemas.microsoft.com/office/word/2012/wordml" xmlns:w16cex="http://schemas.microsoft.com/office/word/2018/wordml/cex" xmlns:w16cid="http://schemas.microsoft.com/office/word/2016/wordml/cid" xmlns:w16="http://schemas.microsoft.com/office/word/2018/wordml" xmlns:w16du="http://schemas.microsoft.com/office/word/2023/wordml/word16du" xmlns:w16sdtdh="http://schemas.microsoft.com/office/word/2020/wordml/sdtdatahash" xmlns:w16se="http://schemas.microsoft.com/office/word/2015/wordml/symex" xmlns:wpg="http://schemas.microsoft.com/office/word/2010/wordprocessingGroup" xmlns:wpi="http://schemas.microsoft.com/office/word/2010/wordprocessingInk" xmlns:wne="http://schemas.microsoft.com/office/word/2006/wordml" xmlns:wps="http://schemas.microsoft.com/office/word/2010/wordprocessingShape" mc:Ignorable="w14 w15 w16se w16cid w16 w16cex w16sdtdh wp14">
+<w:hdr xmlns:wpc="http://schemas.microsoft.com/office/word/2010/wordprocessingCanvas" xmlns:cx="http://schemas.microsoft.com/office/drawing/2014/chartex" xmlns:cx1="http://schemas.microsoft.com/office/drawing/2015/9/8/chartex" xmlns:cx2="http://schemas.microsoft.com/office/drawing/2015/10/21/chartex" xmlns:cx3="http://schemas.microsoft.com/office/drawing/2016/5/9/chartex" xmlns:cx4="http://schemas.microsoft.com/office/drawing/2016/5/10/chartex" xmlns:cx5="http://schemas.microsoft.com/office/drawing/2016/5/11/chartex" xmlns:cx6="http://schemas.microsoft.com/office/drawing/2016/5/12/chartex" xmlns:cx7="http://schemas.microsoft.com/office/drawing/2016/5/13/chartex" xmlns:cx8="http://schemas.microsoft.com/office/drawing/2016/5/14/chartex" xmlns:mc="http://schemas.openxmlformats.org/markup-compatibility/2006" xmlns:aink="http://schemas.microsoft.com/office/drawing/2016/ink" xmlns:am3d="http://schemas.microsoft.com/office/drawing/2017/model3d" xmlns:o="urn:schemas-microsoft-com:office:office" xmlns:oel="http://schemas.microsoft.com/office/2019/extlst" xmlns:r="http://schemas.openxmlformats.org/officeDocument/2006/relationships" xmlns:m="http://schemas.openxmlformats.org/officeDocument/2006/math" xmlns:v="urn:schemas-microsoft-com:vml" xmlns:wp14="http://schemas.microsoft.com/office/word/2010/wordprocessingDrawing" xmlns:wp="http://schemas.openxmlformats.org/drawingml/2006/wordprocessingDrawing" xmlns:w10="urn:schemas-microsoft-com:office:word" xmlns:w="http://schemas.openxmlformats.org/wordprocessingml/2006/main" xmlns:w14="http://schemas.microsoft.com/office/word/2010/wordml" xmlns:w15="http://schemas.microsoft.com/office/word/2012/wordml" xmlns:w16cex="http://schemas.microsoft.com/office/word/2018/wordml/cex" xmlns:w16cid="http://schemas.microsoft.com/office/word/2016/wordml/cid" xmlns:w16="http://schemas.microsoft.com/office/word/2018/wordml" xmlns:w16sdtdh="http://schemas.microsoft.com/office/word/2020/wordml/sdtdatahash" xmlns:w16se="http://schemas.microsoft.com/office/word/2015/wordml/symex" xmlns:wpg="http://schemas.microsoft.com/office/word/2010/wordprocessingGroup" xmlns:wpi="http://schemas.microsoft.com/office/word/2010/wordprocessingInk" xmlns:wne="http://schemas.microsoft.com/office/word/2006/wordml" xmlns:wps="http://schemas.microsoft.com/office/word/2010/wordprocessingShape" mc:Ignorable="w14 w15 w16se w16cid w16 w16cex w16sdtdh wp14">
   <w:p>
     <w:pPr>
       <w:pStyle w:val="Header"/>
@@ -8584,7 +8587,7 @@
 </file>
 
 <file path=word/header3.xml><?xml version="1.0" encoding="utf-8"?>
-<w:hdr xmlns:wpc="http://schemas.microsoft.com/office/word/2010/wordprocessingCanvas" xmlns:cx="http://schemas.microsoft.com/office/drawing/2014/chartex" xmlns:cx1="http://schemas.microsoft.com/office/drawing/2015/9/8/chartex" xmlns:cx2="http://schemas.microsoft.com/office/drawing/2015/10/21/chartex" xmlns:cx3="http://schemas.microsoft.com/office/drawing/2016/5/9/chartex" xmlns:cx4="http://schemas.microsoft.com/office/drawing/2016/5/10/chartex" xmlns:cx5="http://schemas.microsoft.com/office/drawing/2016/5/11/chartex" xmlns:cx6="http://schemas.microsoft.com/office/drawing/2016/5/12/chartex" xmlns:cx7="http://schemas.microsoft.com/office/drawing/2016/5/13/chartex" xmlns:cx8="http://schemas.microsoft.com/office/drawing/2016/5/14/chartex" xmlns:mc="http://schemas.openxmlformats.org/markup-compatibility/2006" xmlns:aink="http://schemas.microsoft.com/office/drawing/2016/ink" xmlns:am3d="http://schemas.microsoft.com/office/drawing/2017/model3d" xmlns:o="urn:schemas-microsoft-com:office:office" xmlns:oel="http://schemas.microsoft.com/office/2019/extlst" xmlns:r="http://schemas.openxmlformats.org/officeDocument/2006/relationships" xmlns:m="http://schemas.openxmlformats.org/officeDocument/2006/math" xmlns:v="urn:schemas-microsoft-com:vml" xmlns:wp14="http://schemas.microsoft.com/office/word/2010/wordprocessingDrawing" xmlns:wp="http://schemas.openxmlformats.org/drawingml/2006/wordprocessingDrawing" xmlns:w10="urn:schemas-microsoft-com:office:word" xmlns:w="http://schemas.openxmlformats.org/wordprocessingml/2006/main" xmlns:w14="http://schemas.microsoft.com/office/word/2010/wordml" xmlns:w15="http://schemas.microsoft.com/office/word/2012/wordml" xmlns:w16cex="http://schemas.microsoft.com/office/word/2018/wordml/cex" xmlns:w16cid="http://schemas.microsoft.com/office/word/2016/wordml/cid" xmlns:w16="http://schemas.microsoft.com/office/word/2018/wordml" xmlns:w16du="http://schemas.microsoft.com/office/word/2023/wordml/word16du" xmlns:w16sdtdh="http://schemas.microsoft.com/office/word/2020/wordml/sdtdatahash" xmlns:w16se="http://schemas.microsoft.com/office/word/2015/wordml/symex" xmlns:wpg="http://schemas.microsoft.com/office/word/2010/wordprocessingGroup" xmlns:wpi="http://schemas.microsoft.com/office/word/2010/wordprocessingInk" xmlns:wne="http://schemas.microsoft.com/office/word/2006/wordml" xmlns:wps="http://schemas.microsoft.com/office/word/2010/wordprocessingShape" mc:Ignorable="w14 w15 w16se w16cid w16 w16cex w16sdtdh wp14">
+<w:hdr xmlns:wpc="http://schemas.microsoft.com/office/word/2010/wordprocessingCanvas" xmlns:cx="http://schemas.microsoft.com/office/drawing/2014/chartex" xmlns:cx1="http://schemas.microsoft.com/office/drawing/2015/9/8/chartex" xmlns:cx2="http://schemas.microsoft.com/office/drawing/2015/10/21/chartex" xmlns:cx3="http://schemas.microsoft.com/office/drawing/2016/5/9/chartex" xmlns:cx4="http://schemas.microsoft.com/office/drawing/2016/5/10/chartex" xmlns:cx5="http://schemas.microsoft.com/office/drawing/2016/5/11/chartex" xmlns:cx6="http://schemas.microsoft.com/office/drawing/2016/5/12/chartex" xmlns:cx7="http://schemas.microsoft.com/office/drawing/2016/5/13/chartex" xmlns:cx8="http://schemas.microsoft.com/office/drawing/2016/5/14/chartex" xmlns:mc="http://schemas.openxmlformats.org/markup-compatibility/2006" xmlns:aink="http://schemas.microsoft.com/office/drawing/2016/ink" xmlns:am3d="http://schemas.microsoft.com/office/drawing/2017/model3d" xmlns:o="urn:schemas-microsoft-com:office:office" xmlns:oel="http://schemas.microsoft.com/office/2019/extlst" xmlns:r="http://schemas.openxmlformats.org/officeDocument/2006/relationships" xmlns:m="http://schemas.openxmlformats.org/officeDocument/2006/math" xmlns:v="urn:schemas-microsoft-com:vml" xmlns:wp14="http://schemas.microsoft.com/office/word/2010/wordprocessingDrawing" xmlns:wp="http://schemas.openxmlformats.org/drawingml/2006/wordprocessingDrawing" xmlns:w10="urn:schemas-microsoft-com:office:word" xmlns:w="http://schemas.openxmlformats.org/wordprocessingml/2006/main" xmlns:w14="http://schemas.microsoft.com/office/word/2010/wordml" xmlns:w15="http://schemas.microsoft.com/office/word/2012/wordml" xmlns:w16cex="http://schemas.microsoft.com/office/word/2018/wordml/cex" xmlns:w16cid="http://schemas.microsoft.com/office/word/2016/wordml/cid" xmlns:w16="http://schemas.microsoft.com/office/word/2018/wordml" xmlns:w16sdtdh="http://schemas.microsoft.com/office/word/2020/wordml/sdtdatahash" xmlns:w16se="http://schemas.microsoft.com/office/word/2015/wordml/symex" xmlns:wpg="http://schemas.microsoft.com/office/word/2010/wordprocessingGroup" xmlns:wpi="http://schemas.microsoft.com/office/word/2010/wordprocessingInk" xmlns:wne="http://schemas.microsoft.com/office/word/2006/wordml" xmlns:wps="http://schemas.microsoft.com/office/word/2010/wordprocessingShape" mc:Ignorable="w14 w15 w16se w16cid w16 w16cex w16sdtdh wp14">
   <w:p>
     <w:pPr>
       <w:pStyle w:val="Header"/>
@@ -8594,7 +8597,7 @@
 </file>
 
 <file path=word/numbering.xml><?xml version="1.0" encoding="utf-8"?>
-<w:numbering xmlns:wpc="http://schemas.microsoft.com/office/word/2010/wordprocessingCanvas" xmlns:cx="http://schemas.microsoft.com/office/drawing/2014/chartex" xmlns:cx1="http://schemas.microsoft.com/office/drawing/2015/9/8/chartex" xmlns:cx2="http://schemas.microsoft.com/office/drawing/2015/10/21/chartex" xmlns:cx3="http://schemas.microsoft.com/office/drawing/2016/5/9/chartex" xmlns:cx4="http://schemas.microsoft.com/office/drawing/2016/5/10/chartex" xmlns:cx5="http://schemas.microsoft.com/office/drawing/2016/5/11/chartex" xmlns:cx6="http://schemas.microsoft.com/office/drawing/2016/5/12/chartex" xmlns:cx7="http://schemas.microsoft.com/office/drawing/2016/5/13/chartex" xmlns:cx8="http://schemas.microsoft.com/office/drawing/2016/5/14/chartex" xmlns:mc="http://schemas.openxmlformats.org/markup-compatibility/2006" xmlns:aink="http://schemas.microsoft.com/office/drawing/2016/ink" xmlns:am3d="http://schemas.microsoft.com/office/drawing/2017/model3d" xmlns:o="urn:schemas-microsoft-com:office:office" xmlns:oel="http://schemas.microsoft.com/office/2019/extlst" xmlns:r="http://schemas.openxmlformats.org/officeDocument/2006/relationships" xmlns:m="http://schemas.openxmlformats.org/officeDocument/2006/math" xmlns:v="urn:schemas-microsoft-com:vml" xmlns:wp14="http://schemas.microsoft.com/office/word/2010/wordprocessingDrawing" xmlns:wp="http://schemas.openxmlformats.org/drawingml/2006/wordprocessingDrawing" xmlns:w10="urn:schemas-microsoft-com:office:word" xmlns:w="http://schemas.openxmlformats.org/wordprocessingml/2006/main" xmlns:w14="http://schemas.microsoft.com/office/word/2010/wordml" xmlns:w15="http://schemas.microsoft.com/office/word/2012/wordml" xmlns:w16cex="http://schemas.microsoft.com/office/word/2018/wordml/cex" xmlns:w16cid="http://schemas.microsoft.com/office/word/2016/wordml/cid" xmlns:w16="http://schemas.microsoft.com/office/word/2018/wordml" xmlns:w16du="http://schemas.microsoft.com/office/word/2023/wordml/word16du" xmlns:w16sdtdh="http://schemas.microsoft.com/office/word/2020/wordml/sdtdatahash" xmlns:w16se="http://schemas.microsoft.com/office/word/2015/wordml/symex" xmlns:wpg="http://schemas.microsoft.com/office/word/2010/wordprocessingGroup" xmlns:wpi="http://schemas.microsoft.com/office/word/2010/wordprocessingInk" xmlns:wne="http://schemas.microsoft.com/office/word/2006/wordml" xmlns:wps="http://schemas.microsoft.com/office/word/2010/wordprocessingShape" mc:Ignorable="w14 w15 w16se w16cid w16 w16cex w16sdtdh wp14">
+<w:numbering xmlns:wpc="http://schemas.microsoft.com/office/word/2010/wordprocessingCanvas" xmlns:cx="http://schemas.microsoft.com/office/drawing/2014/chartex" xmlns:cx1="http://schemas.microsoft.com/office/drawing/2015/9/8/chartex" xmlns:cx2="http://schemas.microsoft.com/office/drawing/2015/10/21/chartex" xmlns:cx3="http://schemas.microsoft.com/office/drawing/2016/5/9/chartex" xmlns:cx4="http://schemas.microsoft.com/office/drawing/2016/5/10/chartex" xmlns:cx5="http://schemas.microsoft.com/office/drawing/2016/5/11/chartex" xmlns:cx6="http://schemas.microsoft.com/office/drawing/2016/5/12/chartex" xmlns:cx7="http://schemas.microsoft.com/office/drawing/2016/5/13/chartex" xmlns:cx8="http://schemas.microsoft.com/office/drawing/2016/5/14/chartex" xmlns:mc="http://schemas.openxmlformats.org/markup-compatibility/2006" xmlns:aink="http://schemas.microsoft.com/office/drawing/2016/ink" xmlns:am3d="http://schemas.microsoft.com/office/drawing/2017/model3d" xmlns:o="urn:schemas-microsoft-com:office:office" xmlns:oel="http://schemas.microsoft.com/office/2019/extlst" xmlns:r="http://schemas.openxmlformats.org/officeDocument/2006/relationships" xmlns:m="http://schemas.openxmlformats.org/officeDocument/2006/math" xmlns:v="urn:schemas-microsoft-com:vml" xmlns:wp14="http://schemas.microsoft.com/office/word/2010/wordprocessingDrawing" xmlns:wp="http://schemas.openxmlformats.org/drawingml/2006/wordprocessingDrawing" xmlns:w10="urn:schemas-microsoft-com:office:word" xmlns:w="http://schemas.openxmlformats.org/wordprocessingml/2006/main" xmlns:w14="http://schemas.microsoft.com/office/word/2010/wordml" xmlns:w15="http://schemas.microsoft.com/office/word/2012/wordml" xmlns:w16cex="http://schemas.microsoft.com/office/word/2018/wordml/cex" xmlns:w16cid="http://schemas.microsoft.com/office/word/2016/wordml/cid" xmlns:w16="http://schemas.microsoft.com/office/word/2018/wordml" xmlns:w16sdtdh="http://schemas.microsoft.com/office/word/2020/wordml/sdtdatahash" xmlns:w16se="http://schemas.microsoft.com/office/word/2015/wordml/symex" xmlns:wpg="http://schemas.microsoft.com/office/word/2010/wordprocessingGroup" xmlns:wpi="http://schemas.microsoft.com/office/word/2010/wordprocessingInk" xmlns:wne="http://schemas.microsoft.com/office/word/2006/wordml" xmlns:wps="http://schemas.microsoft.com/office/word/2010/wordprocessingShape" mc:Ignorable="w14 w15 w16se w16cid w16 w16cex w16sdtdh wp14">
   <w:abstractNum w:abstractNumId="0" w15:restartNumberingAfterBreak="0">
     <w:nsid w:val="08B2501C"/>
     <w:multiLevelType w:val="hybridMultilevel"/>

</xml_diff>